<commit_message>
updated the learning content
</commit_message>
<xml_diff>
--- a/VitalWatch.docx
+++ b/VitalWatch.docx
@@ -47,13 +47,6 @@
         </w:rPr>
         <w:t>-Detection</w:t>
       </w:r>
-    </w:p>
-    <w:p>
-      <w:pPr>
-        <w:rPr>
-          <w:lang w:val="en-US"/>
-        </w:rPr>
-      </w:pPr>
     </w:p>
     <w:p>
       <w:pPr>
@@ -673,6 +666,7 @@
         <w:t xml:space="preserve"> the blood and ventricle pump blood out. Of all the 4, the left ventricle is the most powerful because it pumps blood to the entire body.</w:t>
       </w:r>
     </w:p>
+    <w:p/>
     <w:p>
       <w:pPr>
         <w:spacing w:after="0"/>
@@ -1264,6 +1258,7 @@
         </w:rPr>
       </w:pPr>
     </w:p>
+    <w:p/>
     <w:p>
       <w:r>
         <w:lastRenderedPageBreak/>
@@ -1932,14 +1927,39 @@
     <w:p>
       <w:pPr>
         <w:rPr>
-          <w:lang w:val="en-US"/>
-        </w:rPr>
-      </w:pPr>
-      <w:r>
-        <w:rPr>
           <w:rStyle w:val="IntenseEmphasis"/>
           <w:lang w:val="en-US"/>
         </w:rPr>
+      </w:pPr>
+    </w:p>
+    <w:p>
+      <w:pPr>
+        <w:rPr>
+          <w:rStyle w:val="IntenseEmphasis"/>
+          <w:lang w:val="en-US"/>
+        </w:rPr>
+      </w:pPr>
+    </w:p>
+    <w:p>
+      <w:pPr>
+        <w:rPr>
+          <w:rStyle w:val="IntenseEmphasis"/>
+          <w:lang w:val="en-US"/>
+        </w:rPr>
+      </w:pPr>
+    </w:p>
+    <w:p>
+      <w:pPr>
+        <w:rPr>
+          <w:lang w:val="en-US"/>
+        </w:rPr>
+      </w:pPr>
+      <w:r>
+        <w:rPr>
+          <w:rStyle w:val="IntenseEmphasis"/>
+          <w:lang w:val="en-US"/>
+        </w:rPr>
+        <w:lastRenderedPageBreak/>
         <w:t>Why milli seconds?</w:t>
       </w:r>
       <w:r>
@@ -1953,6 +1973,10 @@
       <w:pPr>
         <w:pStyle w:val="ListParagraph"/>
         <w:rPr>
+          <w:rStyle w:val="IntenseEmphasis"/>
+          <w:i w:val="0"/>
+          <w:iCs w:val="0"/>
+          <w:color w:val="auto"/>
           <w:lang w:val="en-US"/>
         </w:rPr>
       </w:pPr>
@@ -1972,23 +1996,14 @@
     <w:p>
       <w:pPr>
         <w:rPr>
+          <w:lang w:val="en-US"/>
+        </w:rPr>
+      </w:pPr>
+      <w:r>
+        <w:rPr>
           <w:rStyle w:val="IntenseEmphasis"/>
           <w:lang w:val="en-US"/>
         </w:rPr>
-      </w:pPr>
-    </w:p>
-    <w:p>
-      <w:pPr>
-        <w:rPr>
-          <w:lang w:val="en-US"/>
-        </w:rPr>
-      </w:pPr>
-      <w:r>
-        <w:rPr>
-          <w:rStyle w:val="IntenseEmphasis"/>
-          <w:lang w:val="en-US"/>
-        </w:rPr>
-        <w:lastRenderedPageBreak/>
         <w:t>So how does the RR interval help us in learning anything about cardio?</w:t>
       </w:r>
       <w:r>
@@ -2259,6 +2274,7 @@
         </w:numPr>
       </w:pPr>
       <w:r>
+        <w:lastRenderedPageBreak/>
         <w:t>If I’ve to quote it in classical ML term, think of it like an outlier. So, the model counts how many splits it takes and scores each point accordingly.</w:t>
       </w:r>
     </w:p>
@@ -2283,7 +2299,6 @@
         <w:rPr>
           <w:rStyle w:val="IntenseEmphasis"/>
         </w:rPr>
-        <w:lastRenderedPageBreak/>
         <w:t xml:space="preserve">What does </w:t>
       </w:r>
       <w:r>
@@ -2556,6 +2571,7 @@
         <w:t xml:space="preserve"> Let’s say a value of 1 means perfectly in line with the recent rhythm. Anything below is considered to </w:t>
       </w:r>
       <w:r>
+        <w:lastRenderedPageBreak/>
         <w:t>have</w:t>
       </w:r>
       <w:r>
@@ -2579,7 +2595,6 @@
         <w:rPr>
           <w:rStyle w:val="IntenseEmphasis"/>
         </w:rPr>
-        <w:lastRenderedPageBreak/>
         <w:t>So,</w:t>
       </w:r>
       <w:r>
@@ -2792,6 +2807,7 @@
     </w:p>
     <w:p>
       <w:r>
+        <w:lastRenderedPageBreak/>
         <w:t xml:space="preserve">So, </w:t>
       </w:r>
       <w:r>
@@ -2830,7 +2846,6 @@
     </w:p>
     <w:p>
       <w:r>
-        <w:lastRenderedPageBreak/>
         <w:t>I just</w:t>
       </w:r>
       <w:r>
@@ -3127,7 +3142,11 @@
         <w:t>–</w:t>
       </w:r>
       <w:r>
-        <w:t xml:space="preserve"> regulators, doctors, and patients all require explainability.</w:t>
+        <w:t xml:space="preserve"> regulators, </w:t>
+      </w:r>
+      <w:r>
+        <w:lastRenderedPageBreak/>
+        <w:t>doctors, and patients all require explainability.</w:t>
       </w:r>
       <w:r>
         <w:t xml:space="preserve"> </w:t>
@@ -3145,7 +3164,6 @@
         <w:rPr>
           <w:rStyle w:val="IntenseEmphasis"/>
         </w:rPr>
-        <w:lastRenderedPageBreak/>
         <w:t>So</w:t>
       </w:r>
       <w:r>
@@ -3451,10 +3469,18 @@
           <w:rStyle w:val="IntenseEmphasis"/>
         </w:rPr>
       </w:pPr>
-      <w:r>
+    </w:p>
+    <w:p>
+      <w:pPr>
         <w:rPr>
           <w:rStyle w:val="IntenseEmphasis"/>
         </w:rPr>
+      </w:pPr>
+      <w:r>
+        <w:rPr>
+          <w:rStyle w:val="IntenseEmphasis"/>
+        </w:rPr>
+        <w:lastRenderedPageBreak/>
         <w:t>W</w:t>
       </w:r>
       <w:r>
@@ -3493,7 +3519,6 @@
     </w:p>
     <w:p>
       <w:r>
-        <w:lastRenderedPageBreak/>
         <w:t>Of course,</w:t>
       </w:r>
       <w:r>
@@ -3750,7 +3775,11 @@
         <w:t>This then undergoes the translation phase and assume they are being passed down to another set of neurons</w:t>
       </w:r>
       <w:r>
-        <w:t xml:space="preserve">. This phase will be termed now as Layer 2 and let’s assume we have got about 11 neurons in this phase (considering 11 letters from the word GOOD MORNING) and the neurons can be indexed as N1 to N11. Observe one thing here the density of neurons gets increased as we go deeper. Now from these neurons we will decode the letters and try to form the actual word in the required language (Deutsch). </w:t>
+        <w:t xml:space="preserve">. This phase will be termed now as Layer 2 and let’s assume we have got about 11 neurons in this phase (considering 11 letters from the word GOOD MORNING) and the </w:t>
+      </w:r>
+      <w:r>
+        <w:lastRenderedPageBreak/>
+        <w:t xml:space="preserve">neurons can be indexed as N1 to N11. Observe one thing here the density of neurons gets increased as we go deeper. Now from these neurons we will decode the letters and try to form the actual word in the required language (Deutsch). </w:t>
       </w:r>
     </w:p>
     <w:p>
@@ -3762,7 +3791,6 @@
         </w:numPr>
       </w:pPr>
       <w:r>
-        <w:lastRenderedPageBreak/>
         <w:t xml:space="preserve">So, we now combine the outputs from these 11 neurons to form the literal meaning in Deutsch. In the next phase, which is now our Layer 3, will try and form the word out of these letters that are being modulated and they translate GOOD into GUT and MORNING into MORGEN, making our Layer 3 to have 2 neurons now holding these values or the strings within them. </w:t>
       </w:r>
     </w:p>
@@ -3925,11 +3953,28 @@
       </w:r>
     </w:p>
     <w:p>
-      <w:r>
-        <w:rPr>
-          <w:b/>
-          <w:bCs/>
-        </w:rPr>
+      <w:pPr>
+        <w:rPr>
+          <w:b/>
+          <w:bCs/>
+        </w:rPr>
+      </w:pPr>
+    </w:p>
+    <w:p>
+      <w:pPr>
+        <w:rPr>
+          <w:b/>
+          <w:bCs/>
+        </w:rPr>
+      </w:pPr>
+    </w:p>
+    <w:p>
+      <w:r>
+        <w:rPr>
+          <w:b/>
+          <w:bCs/>
+        </w:rPr>
+        <w:lastRenderedPageBreak/>
         <w:t>Adam optimizer</w:t>
       </w:r>
       <w:r>
@@ -3987,11 +4032,7 @@
         <w:t>adaptive learning rate</w:t>
       </w:r>
       <w:r>
-        <w:t xml:space="preserve">: it gives each parameter its own learning rate that adjusts based on how frequently that parameter gets updated. Parameters that rarely change get </w:t>
-      </w:r>
-      <w:r>
-        <w:lastRenderedPageBreak/>
-        <w:t>larger updates. Parameters that change constantly get smaller updates. This is what makes it adaptive.</w:t>
+        <w:t>: it gives each parameter its own learning rate that adjusts based on how frequently that parameter gets updated. Parameters that rarely change get larger updates. Parameters that change constantly get smaller updates. This is what makes it adaptive.</w:t>
       </w:r>
     </w:p>
     <w:p>
@@ -4263,6 +4304,7 @@
         <w:t>. On the other hand, LSTMs keep a track of what happened at 0.9, we are now at 1.0 and predicts if something comes at 1.1.</w:t>
       </w:r>
     </w:p>
+    <w:p/>
     <w:p>
       <w:r>
         <w:t xml:space="preserve">Let’s decode LSTM; </w:t>
@@ -4312,6 +4354,7 @@
     </w:p>
     <w:p>
       <w:r>
+        <w:lastRenderedPageBreak/>
         <w:t xml:space="preserve">Simplest way to understand would be by taking up a funny but a grit example. </w:t>
       </w:r>
       <w:r>
@@ -4329,15 +4372,7 @@
           <w:i/>
           <w:iCs/>
         </w:rPr>
-        <w:t xml:space="preserve"> of Compiler Design &amp; Operating Systems. You will have prepared for the exam for past couple of days for this subject where you might have been thought of system design and kernel operations. How they are built and how do they function. You would also require some knowledge of Theory of Automata while writing this and imagine you had studied automata in the previous semester. You’ve seen and learnt the NFA, DFA, PDA and TM way back then and are also being used currently in the compiler design as well. You’ve seen this, you’ve </w:t>
-      </w:r>
-      <w:r>
-        <w:rPr>
-          <w:i/>
-          <w:iCs/>
-        </w:rPr>
-        <w:lastRenderedPageBreak/>
-        <w:t>learnt this and when you see during the examination you realise this pattern was encountered earlier and then you start recalling all the relevant learnings/pattens from what you’ve seen earlier.</w:t>
+        <w:t xml:space="preserve"> of Compiler Design &amp; Operating Systems. You will have prepared for the exam for past couple of days for this subject where you might have been thought of system design and kernel operations. How they are built and how do they function. You would also require some knowledge of Theory of Automata while writing this and imagine you had studied automata in the previous semester. You’ve seen and learnt the NFA, DFA, PDA and TM way back then and are also being used currently in the compiler design as well. You’ve seen this, you’ve learnt this and when you see during the examination you realise this pattern was encountered earlier and then you start recalling all the relevant learnings/pattens from what you’ve seen earlier.</w:t>
       </w:r>
     </w:p>
     <w:p>
@@ -4788,6 +4823,7 @@
         <w:spacing w:after="0"/>
       </w:pPr>
       <w:r>
+        <w:lastRenderedPageBreak/>
         <w:t>AND – logic:</w:t>
       </w:r>
     </w:p>
@@ -5289,10 +5325,21 @@
           <w:rStyle w:val="IntenseEmphasis"/>
         </w:rPr>
       </w:pPr>
-      <w:r>
+    </w:p>
+    <w:p>
+      <w:pPr>
+        <w:tabs>
+          <w:tab w:val="left" w:pos="2610"/>
+        </w:tabs>
         <w:rPr>
           <w:rStyle w:val="IntenseEmphasis"/>
         </w:rPr>
+      </w:pPr>
+      <w:r>
+        <w:rPr>
+          <w:rStyle w:val="IntenseEmphasis"/>
+        </w:rPr>
+        <w:lastRenderedPageBreak/>
         <w:t xml:space="preserve">But why does LSTM miss so many anomalies despite its memory? </w:t>
       </w:r>
     </w:p>
@@ -5333,20 +5380,6 @@
       <w:r>
         <w:t xml:space="preserve"> not because the model is weak, but because averaging across time works against single-beat anomaly detection.</w:t>
       </w:r>
-    </w:p>
-    <w:p>
-      <w:pPr>
-        <w:tabs>
-          <w:tab w:val="left" w:pos="2610"/>
-        </w:tabs>
-      </w:pPr>
-    </w:p>
-    <w:p>
-      <w:pPr>
-        <w:tabs>
-          <w:tab w:val="left" w:pos="2610"/>
-        </w:tabs>
-      </w:pPr>
     </w:p>
     <w:p>
       <w:pPr>
@@ -5692,13 +5725,6 @@
           <w:tab w:val="left" w:pos="2610"/>
         </w:tabs>
       </w:pPr>
-    </w:p>
-    <w:p>
-      <w:pPr>
-        <w:tabs>
-          <w:tab w:val="left" w:pos="2610"/>
-        </w:tabs>
-      </w:pPr>
       <w:r>
         <w:t xml:space="preserve">We use </w:t>
       </w:r>
@@ -5720,42 +5746,16 @@
         </w:tabs>
         <w:rPr>
           <w:rStyle w:val="IntenseEmphasis"/>
-        </w:rPr>
-      </w:pPr>
-    </w:p>
-    <w:p>
-      <w:pPr>
-        <w:tabs>
-          <w:tab w:val="left" w:pos="2610"/>
-        </w:tabs>
+          <w:i w:val="0"/>
+          <w:iCs w:val="0"/>
+          <w:color w:val="auto"/>
+        </w:rPr>
+      </w:pPr>
+      <w:r>
         <w:rPr>
           <w:rStyle w:val="IntenseEmphasis"/>
         </w:rPr>
-      </w:pPr>
-    </w:p>
-    <w:p>
-      <w:pPr>
-        <w:tabs>
-          <w:tab w:val="left" w:pos="2610"/>
-        </w:tabs>
-        <w:rPr>
-          <w:rStyle w:val="IntenseEmphasis"/>
-        </w:rPr>
-      </w:pPr>
-    </w:p>
-    <w:p>
-      <w:pPr>
-        <w:tabs>
-          <w:tab w:val="left" w:pos="2610"/>
-        </w:tabs>
-        <w:rPr>
-          <w:rStyle w:val="IntenseEmphasis"/>
-        </w:rPr>
-      </w:pPr>
-      <w:r>
-        <w:rPr>
-          <w:rStyle w:val="IntenseEmphasis"/>
-        </w:rPr>
+        <w:lastRenderedPageBreak/>
         <w:t>So,</w:t>
       </w:r>
       <w:r>
@@ -6243,27 +6243,27 @@
         </w:tabs>
       </w:pPr>
       <w:r>
+        <w:t>3. Convert BPM -&gt; 6 features</w:t>
+      </w:r>
+    </w:p>
+    <w:p>
+      <w:pPr>
+        <w:tabs>
+          <w:tab w:val="left" w:pos="2610"/>
+        </w:tabs>
+      </w:pPr>
+      <w:r>
+        <w:t>4. Scale using training scaler</w:t>
+      </w:r>
+    </w:p>
+    <w:p>
+      <w:pPr>
+        <w:tabs>
+          <w:tab w:val="left" w:pos="2610"/>
+        </w:tabs>
+      </w:pPr>
+      <w:r>
         <w:lastRenderedPageBreak/>
-        <w:t>3. Convert BPM -&gt; 6 features</w:t>
-      </w:r>
-    </w:p>
-    <w:p>
-      <w:pPr>
-        <w:tabs>
-          <w:tab w:val="left" w:pos="2610"/>
-        </w:tabs>
-      </w:pPr>
-      <w:r>
-        <w:t>4. Scale using training scaler</w:t>
-      </w:r>
-    </w:p>
-    <w:p>
-      <w:pPr>
-        <w:tabs>
-          <w:tab w:val="left" w:pos="2610"/>
-        </w:tabs>
-      </w:pPr>
-      <w:r>
         <w:t xml:space="preserve">5. Run Isolation Forest -&gt; </w:t>
       </w:r>
       <w:r>
@@ -6375,13 +6375,7 @@
         </w:tabs>
       </w:pPr>
       <w:r>
-        <w:t xml:space="preserve">VitalWatch started as a question </w:t>
-      </w:r>
-      <w:r>
-        <w:t>–</w:t>
-      </w:r>
-      <w:r>
-        <w:t xml:space="preserve"> </w:t>
+        <w:t xml:space="preserve">VitalWatch started as a question – </w:t>
       </w:r>
       <w:r>
         <w:rPr>
@@ -6448,66 +6442,2564 @@
         </w:tabs>
       </w:pPr>
       <w:r>
-        <w:t xml:space="preserve">Every model taught something. Every failure pointed somewhere. That is what this project actually is </w:t>
+        <w:t>Every model taught something. Every failure pointed somewhere. That is what this project actually is – not a finished product, but a documented journey of building something real, understanding why it works, and knowing exactly where it breaks.</w:t>
+      </w:r>
+    </w:p>
+    <w:p>
+      <w:pPr>
+        <w:tabs>
+          <w:tab w:val="left" w:pos="2610"/>
+        </w:tabs>
+      </w:pPr>
+      <w:r>
+        <w:t xml:space="preserve">The live dashboard running on my own heart rate is </w:t>
+      </w:r>
+      <w:r>
+        <w:rPr>
+          <w:b/>
+          <w:bCs/>
+        </w:rPr>
+        <w:t>NOT</w:t>
+      </w:r>
+      <w:r>
+        <w:t xml:space="preserve"> a medical device. It is proof that the pipeline works end to end – from a 1970s clinical database in Boston to a Streamlit app in Trier in 2026, with my own heartbeat flowing through models I built from scratch.</w:t>
+      </w:r>
+    </w:p>
+    <w:p>
+      <w:pPr>
+        <w:tabs>
+          <w:tab w:val="left" w:pos="2610"/>
+        </w:tabs>
+      </w:pPr>
+      <w:r>
+        <w:t xml:space="preserve">VitalWatch V2 is complete. The next version already knows what it needs – more patients, an improved Autoencoder, and a threshold that adapts to each individual's baseline rather than the training </w:t>
+      </w:r>
+      <w:r>
+        <w:t>populations</w:t>
+      </w:r>
+      <w:r>
+        <w:t>. The architecture is ready. The understanding is there. What remains is building it.</w:t>
+      </w:r>
+    </w:p>
+    <w:p>
+      <w:pPr>
+        <w:tabs>
+          <w:tab w:val="left" w:pos="2610"/>
+        </w:tabs>
+      </w:pPr>
+      <w:r>
+        <w:t>==================================================================================</w:t>
+      </w:r>
+    </w:p>
+    <w:p>
+      <w:pPr>
+        <w:tabs>
+          <w:tab w:val="left" w:pos="2610"/>
+        </w:tabs>
+      </w:pPr>
+      <w:r>
+        <w:t>Moving on to the next phase we load all the data excluding two records making the total count to be 46. Same operations are followed. But there are entirely different outcomes now from the initial phase we looked at. Remember the class imbalance story from phase 1-2? Where we looked at single data for “Patient 100” and observed the normal beats to be around 98.5% and abnormal beats to be around 1.5%. But across the full database we have the normal beats around 69.2% and abnormal beats around 30.8%. I mean this is a massive difference and interestingly complex that what I had thought. This is a fundamentally different distribution. This gives us the meaning that the challenge we were looking at class imbalance is not just the thing, but it is also the heterogeneity. That implies our model must handle the full spectrum from 100% abnormal beats to 0.8% abnormal beats.</w:t>
+      </w:r>
+    </w:p>
+    <w:p>
+      <w:pPr>
+        <w:tabs>
+          <w:tab w:val="left" w:pos="2610"/>
+        </w:tabs>
+      </w:pPr>
+      <w:r>
+        <w:rPr>
+          <w:rStyle w:val="IntenseEmphasis"/>
+        </w:rPr>
+        <w:lastRenderedPageBreak/>
+        <w:t>What does heterogeneity in the class data mean here?</w:t>
+      </w:r>
+      <w:r>
+        <w:t xml:space="preserve"> Note that:</w:t>
+      </w:r>
+    </w:p>
+    <w:p>
+      <w:pPr>
+        <w:numPr>
+          <w:ilvl w:val="0"/>
+          <w:numId w:val="8"/>
+        </w:numPr>
+        <w:tabs>
+          <w:tab w:val="left" w:pos="2610"/>
+        </w:tabs>
+      </w:pPr>
+      <w:r>
+        <w:t>8 records are 100% abnormal - no normal beats at all</w:t>
+      </w:r>
+    </w:p>
+    <w:p>
+      <w:pPr>
+        <w:numPr>
+          <w:ilvl w:val="0"/>
+          <w:numId w:val="8"/>
+        </w:numPr>
+        <w:tabs>
+          <w:tab w:val="left" w:pos="2610"/>
+        </w:tabs>
+      </w:pPr>
+      <w:r>
+        <w:t>Record 122 is 99.9% normal - only 2 abnormal beats</w:t>
+      </w:r>
+    </w:p>
+    <w:p>
+      <w:pPr>
+        <w:numPr>
+          <w:ilvl w:val="0"/>
+          <w:numId w:val="8"/>
+        </w:numPr>
+        <w:tabs>
+          <w:tab w:val="left" w:pos="2610"/>
+        </w:tabs>
+      </w:pPr>
+      <w:r>
+        <w:t>Record 208 is 47.8% abnormal - nearly balanced</w:t>
+      </w:r>
+    </w:p>
+    <w:p>
+      <w:pPr>
+        <w:tabs>
+          <w:tab w:val="left" w:pos="2610"/>
+        </w:tabs>
+      </w:pPr>
+      <w:r>
+        <w:t>There are such variance or dissimilarities in the dataset which complicated the whole view and the assumptions what we had made from phase-1.</w:t>
+      </w:r>
+      <w:r>
+        <w:t xml:space="preserve"> </w:t>
+      </w:r>
+      <w:r>
+        <w:t xml:space="preserve">This is what makes VitalWatch V2 more honest than V1 </w:t>
       </w:r>
       <w:r>
         <w:t>–</w:t>
       </w:r>
       <w:r>
-        <w:t xml:space="preserve"> not a finished product, but a documented journey of building something real, understanding why it works, and knowing exactly where it breaks.</w:t>
-      </w:r>
-    </w:p>
-    <w:p>
-      <w:pPr>
-        <w:tabs>
-          <w:tab w:val="left" w:pos="2610"/>
-        </w:tabs>
-      </w:pPr>
-      <w:r>
-        <w:t xml:space="preserve">The live dashboard running on my own heart rate is </w:t>
-      </w:r>
-      <w:r>
-        <w:rPr>
-          <w:b/>
-          <w:bCs/>
-        </w:rPr>
-        <w:t>NOT</w:t>
-      </w:r>
-      <w:r>
-        <w:t xml:space="preserve"> a medical device. It is proof that the pipeline works end to end </w:t>
+        <w:t xml:space="preserve"> not better numbers, but a deeper understanding of what the numbers actually mean across different hearts.</w:t>
+      </w:r>
+    </w:p>
+    <w:p>
+      <w:pPr>
+        <w:tabs>
+          <w:tab w:val="left" w:pos="2610"/>
+        </w:tabs>
+      </w:pPr>
+      <w:r>
+        <w:t xml:space="preserve">Records 107, 109, 111, 118, 124, 207, 214, 232 show </w:t>
+      </w:r>
+      <w:r>
+        <w:rPr>
+          <w:b/>
+          <w:bCs/>
+        </w:rPr>
+        <w:t>100% abnormal beats</w:t>
+      </w:r>
+      <w:r>
+        <w:t>.</w:t>
+      </w:r>
+      <w:r>
+        <w:t xml:space="preserve"> They do not contain N-beats at all! They only consist of </w:t>
+      </w:r>
+      <w:r>
+        <w:t xml:space="preserve">bundle branch blocks, paced rhythms, or complete arrhythmias. Training our Isolation Forest on these records' "normal" beats is meaningless </w:t>
       </w:r>
       <w:r>
         <w:t>–</w:t>
       </w:r>
       <w:r>
-        <w:t xml:space="preserve"> from a 1970s clinical database in Boston to a Streamlit app in Trier in 2026, with my own heartbeat flowing through models I built from scratch.</w:t>
-      </w:r>
-    </w:p>
-    <w:p>
-      <w:pPr>
-        <w:tabs>
-          <w:tab w:val="left" w:pos="2610"/>
-        </w:tabs>
-      </w:pPr>
-      <w:r>
-        <w:t xml:space="preserve">VitalWatch V2 is complete. The next version already knows what it needs </w:t>
+        <w:t xml:space="preserve"> there</w:t>
+      </w:r>
+      <w:r>
+        <w:t xml:space="preserve"> </w:t>
+      </w:r>
+      <w:r>
+        <w:t>are none.</w:t>
+      </w:r>
+    </w:p>
+    <w:p>
+      <w:pPr>
+        <w:tabs>
+          <w:tab w:val="left" w:pos="2610"/>
+        </w:tabs>
+        <w:rPr>
+          <w:rStyle w:val="IntenseEmphasis"/>
+        </w:rPr>
+      </w:pPr>
+      <w:r>
+        <w:rPr>
+          <w:rStyle w:val="IntenseEmphasis"/>
+        </w:rPr>
+        <w:t>What do we do now? How do we handle this scenario?</w:t>
+      </w:r>
+    </w:p>
+    <w:p>
+      <w:pPr>
+        <w:pStyle w:val="ListParagraph"/>
+      </w:pPr>
+      <w:r>
+        <w:t>The simplest but a significant answer would be to discard these records from training and to introduce these in testing only.</w:t>
+      </w:r>
+    </w:p>
+    <w:p>
+      <w:pPr>
+        <w:tabs>
+          <w:tab w:val="left" w:pos="2610"/>
+        </w:tabs>
+        <w:rPr>
+          <w:rStyle w:val="IntenseEmphasis"/>
+        </w:rPr>
+      </w:pPr>
+      <w:r>
+        <w:rPr>
+          <w:rStyle w:val="IntenseEmphasis"/>
+        </w:rPr>
+        <w:t>Now why did we opt this approach? Why not bring up another strategy?</w:t>
+      </w:r>
+    </w:p>
+    <w:p>
+      <w:pPr>
+        <w:pStyle w:val="ListParagraph"/>
+      </w:pPr>
+      <w:r>
+        <w:t xml:space="preserve">We could definitely include them in the training, but it is also important to note that how these records may impact the learning nature of the model. You will need to explicitly mention the reason for the dip in performance when the model encounters 100% abnormal beats or the way it will handle such situations. </w:t>
+      </w:r>
+    </w:p>
+    <w:p>
+      <w:pPr>
+        <w:tabs>
+          <w:tab w:val="left" w:pos="2610"/>
+        </w:tabs>
+      </w:pPr>
+      <w:r>
+        <w:t>I’d rather prefer to train the model with at least 50% normal beats and test across all records. This way we get to see how the model performs when it encounters zero normal beats and how does it isolate each point or the features from these records. In simple terms, think of these like an outlier. We input these outlier points and evaluate the model how did it actually handle such data points.</w:t>
+      </w:r>
+    </w:p>
+    <w:p>
+      <w:pPr>
+        <w:tabs>
+          <w:tab w:val="left" w:pos="2610"/>
+        </w:tabs>
+      </w:pPr>
+      <w:r>
+        <w:t>The symbol distribution across the complete dataset goes like this:</w:t>
+      </w:r>
+    </w:p>
+    <w:tbl>
+      <w:tblPr>
+        <w:tblStyle w:val="PlainTable1"/>
+        <w:tblW w:w="0" w:type="auto"/>
+        <w:tblLook w:val="04A0" w:firstRow="1" w:lastRow="0" w:firstColumn="1" w:lastColumn="0" w:noHBand="0" w:noVBand="1"/>
+      </w:tblPr>
+      <w:tblGrid>
+        <w:gridCol w:w="894"/>
+        <w:gridCol w:w="3268"/>
+        <w:gridCol w:w="829"/>
+      </w:tblGrid>
+      <w:tr>
+        <w:trPr>
+          <w:cnfStyle w:val="100000000000" w:firstRow="1" w:lastRow="0" w:firstColumn="0" w:lastColumn="0" w:oddVBand="0" w:evenVBand="0" w:oddHBand="0" w:evenHBand="0" w:firstRowFirstColumn="0" w:firstRowLastColumn="0" w:lastRowFirstColumn="0" w:lastRowLastColumn="0"/>
+        </w:trPr>
+        <w:tc>
+          <w:tcPr>
+            <w:cnfStyle w:val="001000000000" w:firstRow="0" w:lastRow="0" w:firstColumn="1" w:lastColumn="0" w:oddVBand="0" w:evenVBand="0" w:oddHBand="0" w:evenHBand="0" w:firstRowFirstColumn="0" w:firstRowLastColumn="0" w:lastRowFirstColumn="0" w:lastRowLastColumn="0"/>
+            <w:tcW w:w="0" w:type="auto"/>
+            <w:hideMark/>
+          </w:tcPr>
+          <w:p>
+            <w:pPr>
+              <w:tabs>
+                <w:tab w:val="left" w:pos="2610"/>
+              </w:tabs>
+              <w:spacing w:after="200" w:line="276" w:lineRule="auto"/>
+            </w:pPr>
+            <w:r>
+              <w:t>Symbol</w:t>
+            </w:r>
+          </w:p>
+        </w:tc>
+        <w:tc>
+          <w:tcPr>
+            <w:tcW w:w="0" w:type="auto"/>
+            <w:hideMark/>
+          </w:tcPr>
+          <w:p>
+            <w:pPr>
+              <w:tabs>
+                <w:tab w:val="left" w:pos="2610"/>
+              </w:tabs>
+              <w:spacing w:after="200" w:line="276" w:lineRule="auto"/>
+              <w:cnfStyle w:val="100000000000" w:firstRow="1" w:lastRow="0" w:firstColumn="0" w:lastColumn="0" w:oddVBand="0" w:evenVBand="0" w:oddHBand="0" w:evenHBand="0" w:firstRowFirstColumn="0" w:firstRowLastColumn="0" w:lastRowFirstColumn="0" w:lastRowLastColumn="0"/>
+            </w:pPr>
+            <w:r>
+              <w:t>Clinical Name</w:t>
+            </w:r>
+          </w:p>
+        </w:tc>
+        <w:tc>
+          <w:tcPr>
+            <w:tcW w:w="0" w:type="auto"/>
+            <w:hideMark/>
+          </w:tcPr>
+          <w:p>
+            <w:pPr>
+              <w:tabs>
+                <w:tab w:val="left" w:pos="2610"/>
+              </w:tabs>
+              <w:spacing w:after="200" w:line="276" w:lineRule="auto"/>
+              <w:cnfStyle w:val="100000000000" w:firstRow="1" w:lastRow="0" w:firstColumn="0" w:lastColumn="0" w:oddVBand="0" w:evenVBand="0" w:oddHBand="0" w:evenHBand="0" w:firstRowFirstColumn="0" w:firstRowLastColumn="0" w:lastRowFirstColumn="0" w:lastRowLastColumn="0"/>
+            </w:pPr>
+            <w:r>
+              <w:t>Count</w:t>
+            </w:r>
+          </w:p>
+        </w:tc>
+      </w:tr>
+      <w:tr>
+        <w:trPr>
+          <w:cnfStyle w:val="000000100000" w:firstRow="0" w:lastRow="0" w:firstColumn="0" w:lastColumn="0" w:oddVBand="0" w:evenVBand="0" w:oddHBand="1" w:evenHBand="0" w:firstRowFirstColumn="0" w:firstRowLastColumn="0" w:lastRowFirstColumn="0" w:lastRowLastColumn="0"/>
+        </w:trPr>
+        <w:tc>
+          <w:tcPr>
+            <w:cnfStyle w:val="001000000000" w:firstRow="0" w:lastRow="0" w:firstColumn="1" w:lastColumn="0" w:oddVBand="0" w:evenVBand="0" w:oddHBand="0" w:evenHBand="0" w:firstRowFirstColumn="0" w:firstRowLastColumn="0" w:lastRowFirstColumn="0" w:lastRowLastColumn="0"/>
+            <w:tcW w:w="0" w:type="auto"/>
+            <w:hideMark/>
+          </w:tcPr>
+          <w:p>
+            <w:pPr>
+              <w:tabs>
+                <w:tab w:val="left" w:pos="2610"/>
+              </w:tabs>
+              <w:spacing w:after="200" w:line="276" w:lineRule="auto"/>
+            </w:pPr>
+            <w:r>
+              <w:t>N</w:t>
+            </w:r>
+          </w:p>
+        </w:tc>
+        <w:tc>
+          <w:tcPr>
+            <w:tcW w:w="0" w:type="auto"/>
+            <w:hideMark/>
+          </w:tcPr>
+          <w:p>
+            <w:pPr>
+              <w:tabs>
+                <w:tab w:val="left" w:pos="2610"/>
+              </w:tabs>
+              <w:spacing w:after="200" w:line="276" w:lineRule="auto"/>
+              <w:cnfStyle w:val="000000100000" w:firstRow="0" w:lastRow="0" w:firstColumn="0" w:lastColumn="0" w:oddVBand="0" w:evenVBand="0" w:oddHBand="1" w:evenHBand="0" w:firstRowFirstColumn="0" w:firstRowLastColumn="0" w:lastRowFirstColumn="0" w:lastRowLastColumn="0"/>
+            </w:pPr>
+            <w:r>
+              <w:t>Normal sinus beat</w:t>
+            </w:r>
+          </w:p>
+        </w:tc>
+        <w:tc>
+          <w:tcPr>
+            <w:tcW w:w="0" w:type="auto"/>
+            <w:hideMark/>
+          </w:tcPr>
+          <w:p>
+            <w:pPr>
+              <w:tabs>
+                <w:tab w:val="left" w:pos="2610"/>
+              </w:tabs>
+              <w:spacing w:after="200" w:line="276" w:lineRule="auto"/>
+              <w:cnfStyle w:val="000000100000" w:firstRow="0" w:lastRow="0" w:firstColumn="0" w:lastColumn="0" w:oddVBand="0" w:evenVBand="0" w:oddHBand="1" w:evenHBand="0" w:firstRowFirstColumn="0" w:firstRowLastColumn="0" w:lastRowFirstColumn="0" w:lastRowLastColumn="0"/>
+            </w:pPr>
+            <w:r>
+              <w:t>74,790</w:t>
+            </w:r>
+          </w:p>
+        </w:tc>
+      </w:tr>
+      <w:tr>
+        <w:tc>
+          <w:tcPr>
+            <w:cnfStyle w:val="001000000000" w:firstRow="0" w:lastRow="0" w:firstColumn="1" w:lastColumn="0" w:oddVBand="0" w:evenVBand="0" w:oddHBand="0" w:evenHBand="0" w:firstRowFirstColumn="0" w:firstRowLastColumn="0" w:lastRowFirstColumn="0" w:lastRowLastColumn="0"/>
+            <w:tcW w:w="0" w:type="auto"/>
+            <w:hideMark/>
+          </w:tcPr>
+          <w:p>
+            <w:pPr>
+              <w:tabs>
+                <w:tab w:val="left" w:pos="2610"/>
+              </w:tabs>
+              <w:spacing w:after="200" w:line="276" w:lineRule="auto"/>
+            </w:pPr>
+            <w:r>
+              <w:t>L</w:t>
+            </w:r>
+          </w:p>
+        </w:tc>
+        <w:tc>
+          <w:tcPr>
+            <w:tcW w:w="0" w:type="auto"/>
+            <w:hideMark/>
+          </w:tcPr>
+          <w:p>
+            <w:pPr>
+              <w:tabs>
+                <w:tab w:val="left" w:pos="2610"/>
+              </w:tabs>
+              <w:spacing w:after="200" w:line="276" w:lineRule="auto"/>
+              <w:cnfStyle w:val="000000000000" w:firstRow="0" w:lastRow="0" w:firstColumn="0" w:lastColumn="0" w:oddVBand="0" w:evenVBand="0" w:oddHBand="0" w:evenHBand="0" w:firstRowFirstColumn="0" w:firstRowLastColumn="0" w:lastRowFirstColumn="0" w:lastRowLastColumn="0"/>
+            </w:pPr>
+            <w:r>
+              <w:t>Left bundle branch block</w:t>
+            </w:r>
+          </w:p>
+        </w:tc>
+        <w:tc>
+          <w:tcPr>
+            <w:tcW w:w="0" w:type="auto"/>
+            <w:hideMark/>
+          </w:tcPr>
+          <w:p>
+            <w:pPr>
+              <w:tabs>
+                <w:tab w:val="left" w:pos="2610"/>
+              </w:tabs>
+              <w:spacing w:after="200" w:line="276" w:lineRule="auto"/>
+              <w:cnfStyle w:val="000000000000" w:firstRow="0" w:lastRow="0" w:firstColumn="0" w:lastColumn="0" w:oddVBand="0" w:evenVBand="0" w:oddHBand="0" w:evenHBand="0" w:firstRowFirstColumn="0" w:firstRowLastColumn="0" w:lastRowFirstColumn="0" w:lastRowLastColumn="0"/>
+            </w:pPr>
+            <w:r>
+              <w:t>8,075</w:t>
+            </w:r>
+          </w:p>
+        </w:tc>
+      </w:tr>
+      <w:tr>
+        <w:trPr>
+          <w:cnfStyle w:val="000000100000" w:firstRow="0" w:lastRow="0" w:firstColumn="0" w:lastColumn="0" w:oddVBand="0" w:evenVBand="0" w:oddHBand="1" w:evenHBand="0" w:firstRowFirstColumn="0" w:firstRowLastColumn="0" w:lastRowFirstColumn="0" w:lastRowLastColumn="0"/>
+        </w:trPr>
+        <w:tc>
+          <w:tcPr>
+            <w:cnfStyle w:val="001000000000" w:firstRow="0" w:lastRow="0" w:firstColumn="1" w:lastColumn="0" w:oddVBand="0" w:evenVBand="0" w:oddHBand="0" w:evenHBand="0" w:firstRowFirstColumn="0" w:firstRowLastColumn="0" w:lastRowFirstColumn="0" w:lastRowLastColumn="0"/>
+            <w:tcW w:w="0" w:type="auto"/>
+            <w:hideMark/>
+          </w:tcPr>
+          <w:p>
+            <w:pPr>
+              <w:tabs>
+                <w:tab w:val="left" w:pos="2610"/>
+              </w:tabs>
+              <w:spacing w:after="200" w:line="276" w:lineRule="auto"/>
+            </w:pPr>
+            <w:r>
+              <w:t>R</w:t>
+            </w:r>
+          </w:p>
+        </w:tc>
+        <w:tc>
+          <w:tcPr>
+            <w:tcW w:w="0" w:type="auto"/>
+            <w:hideMark/>
+          </w:tcPr>
+          <w:p>
+            <w:pPr>
+              <w:tabs>
+                <w:tab w:val="left" w:pos="2610"/>
+              </w:tabs>
+              <w:spacing w:after="200" w:line="276" w:lineRule="auto"/>
+              <w:cnfStyle w:val="000000100000" w:firstRow="0" w:lastRow="0" w:firstColumn="0" w:lastColumn="0" w:oddVBand="0" w:evenVBand="0" w:oddHBand="1" w:evenHBand="0" w:firstRowFirstColumn="0" w:firstRowLastColumn="0" w:lastRowFirstColumn="0" w:lastRowLastColumn="0"/>
+            </w:pPr>
+            <w:r>
+              <w:t>Right bundle branch block</w:t>
+            </w:r>
+          </w:p>
+        </w:tc>
+        <w:tc>
+          <w:tcPr>
+            <w:tcW w:w="0" w:type="auto"/>
+            <w:hideMark/>
+          </w:tcPr>
+          <w:p>
+            <w:pPr>
+              <w:tabs>
+                <w:tab w:val="left" w:pos="2610"/>
+              </w:tabs>
+              <w:spacing w:after="200" w:line="276" w:lineRule="auto"/>
+              <w:cnfStyle w:val="000000100000" w:firstRow="0" w:lastRow="0" w:firstColumn="0" w:lastColumn="0" w:oddVBand="0" w:evenVBand="0" w:oddHBand="1" w:evenHBand="0" w:firstRowFirstColumn="0" w:firstRowLastColumn="0" w:lastRowFirstColumn="0" w:lastRowLastColumn="0"/>
+            </w:pPr>
+            <w:r>
+              <w:t>7,259</w:t>
+            </w:r>
+          </w:p>
+        </w:tc>
+      </w:tr>
+      <w:tr>
+        <w:tc>
+          <w:tcPr>
+            <w:cnfStyle w:val="001000000000" w:firstRow="0" w:lastRow="0" w:firstColumn="1" w:lastColumn="0" w:oddVBand="0" w:evenVBand="0" w:oddHBand="0" w:evenHBand="0" w:firstRowFirstColumn="0" w:firstRowLastColumn="0" w:lastRowFirstColumn="0" w:lastRowLastColumn="0"/>
+            <w:tcW w:w="0" w:type="auto"/>
+            <w:hideMark/>
+          </w:tcPr>
+          <w:p>
+            <w:pPr>
+              <w:tabs>
+                <w:tab w:val="left" w:pos="2610"/>
+              </w:tabs>
+              <w:spacing w:after="200" w:line="276" w:lineRule="auto"/>
+            </w:pPr>
+            <w:r>
+              <w:t>V</w:t>
+            </w:r>
+          </w:p>
+        </w:tc>
+        <w:tc>
+          <w:tcPr>
+            <w:tcW w:w="0" w:type="auto"/>
+            <w:hideMark/>
+          </w:tcPr>
+          <w:p>
+            <w:pPr>
+              <w:tabs>
+                <w:tab w:val="left" w:pos="2610"/>
+              </w:tabs>
+              <w:spacing w:after="200" w:line="276" w:lineRule="auto"/>
+              <w:cnfStyle w:val="000000000000" w:firstRow="0" w:lastRow="0" w:firstColumn="0" w:lastColumn="0" w:oddVBand="0" w:evenVBand="0" w:oddHBand="0" w:evenHBand="0" w:firstRowFirstColumn="0" w:firstRowLastColumn="0" w:lastRowFirstColumn="0" w:lastRowLastColumn="0"/>
+            </w:pPr>
+            <w:r>
+              <w:t>Premature ventricular contraction</w:t>
+            </w:r>
+          </w:p>
+        </w:tc>
+        <w:tc>
+          <w:tcPr>
+            <w:tcW w:w="0" w:type="auto"/>
+            <w:hideMark/>
+          </w:tcPr>
+          <w:p>
+            <w:pPr>
+              <w:tabs>
+                <w:tab w:val="left" w:pos="2610"/>
+              </w:tabs>
+              <w:spacing w:after="200" w:line="276" w:lineRule="auto"/>
+              <w:cnfStyle w:val="000000000000" w:firstRow="0" w:lastRow="0" w:firstColumn="0" w:lastColumn="0" w:oddVBand="0" w:evenVBand="0" w:oddHBand="0" w:evenHBand="0" w:firstRowFirstColumn="0" w:firstRowLastColumn="0" w:lastRowFirstColumn="0" w:lastRowLastColumn="0"/>
+            </w:pPr>
+            <w:r>
+              <w:t>7,124</w:t>
+            </w:r>
+          </w:p>
+        </w:tc>
+      </w:tr>
+      <w:tr>
+        <w:trPr>
+          <w:cnfStyle w:val="000000100000" w:firstRow="0" w:lastRow="0" w:firstColumn="0" w:lastColumn="0" w:oddVBand="0" w:evenVBand="0" w:oddHBand="1" w:evenHBand="0" w:firstRowFirstColumn="0" w:firstRowLastColumn="0" w:lastRowFirstColumn="0" w:lastRowLastColumn="0"/>
+        </w:trPr>
+        <w:tc>
+          <w:tcPr>
+            <w:cnfStyle w:val="001000000000" w:firstRow="0" w:lastRow="0" w:firstColumn="1" w:lastColumn="0" w:oddVBand="0" w:evenVBand="0" w:oddHBand="0" w:evenHBand="0" w:firstRowFirstColumn="0" w:firstRowLastColumn="0" w:lastRowFirstColumn="0" w:lastRowLastColumn="0"/>
+            <w:tcW w:w="0" w:type="auto"/>
+            <w:hideMark/>
+          </w:tcPr>
+          <w:p>
+            <w:pPr>
+              <w:tabs>
+                <w:tab w:val="left" w:pos="2610"/>
+              </w:tabs>
+              <w:spacing w:after="200" w:line="276" w:lineRule="auto"/>
+            </w:pPr>
+            <w:r>
+              <w:t>/</w:t>
+            </w:r>
+          </w:p>
+        </w:tc>
+        <w:tc>
+          <w:tcPr>
+            <w:tcW w:w="0" w:type="auto"/>
+            <w:hideMark/>
+          </w:tcPr>
+          <w:p>
+            <w:pPr>
+              <w:tabs>
+                <w:tab w:val="left" w:pos="2610"/>
+              </w:tabs>
+              <w:spacing w:after="200" w:line="276" w:lineRule="auto"/>
+              <w:cnfStyle w:val="000000100000" w:firstRow="0" w:lastRow="0" w:firstColumn="0" w:lastColumn="0" w:oddVBand="0" w:evenVBand="0" w:oddHBand="1" w:evenHBand="0" w:firstRowFirstColumn="0" w:firstRowLastColumn="0" w:lastRowFirstColumn="0" w:lastRowLastColumn="0"/>
+            </w:pPr>
+            <w:r>
+              <w:t>Paced beat</w:t>
+            </w:r>
+          </w:p>
+        </w:tc>
+        <w:tc>
+          <w:tcPr>
+            <w:tcW w:w="0" w:type="auto"/>
+            <w:hideMark/>
+          </w:tcPr>
+          <w:p>
+            <w:pPr>
+              <w:tabs>
+                <w:tab w:val="left" w:pos="2610"/>
+              </w:tabs>
+              <w:spacing w:after="200" w:line="276" w:lineRule="auto"/>
+              <w:cnfStyle w:val="000000100000" w:firstRow="0" w:lastRow="0" w:firstColumn="0" w:lastColumn="0" w:oddVBand="0" w:evenVBand="0" w:oddHBand="1" w:evenHBand="0" w:firstRowFirstColumn="0" w:firstRowLastColumn="0" w:lastRowFirstColumn="0" w:lastRowLastColumn="0"/>
+            </w:pPr>
+            <w:r>
+              <w:t>3,620</w:t>
+            </w:r>
+          </w:p>
+        </w:tc>
+      </w:tr>
+      <w:tr>
+        <w:tc>
+          <w:tcPr>
+            <w:cnfStyle w:val="001000000000" w:firstRow="0" w:lastRow="0" w:firstColumn="1" w:lastColumn="0" w:oddVBand="0" w:evenVBand="0" w:oddHBand="0" w:evenHBand="0" w:firstRowFirstColumn="0" w:firstRowLastColumn="0" w:lastRowFirstColumn="0" w:lastRowLastColumn="0"/>
+            <w:tcW w:w="0" w:type="auto"/>
+            <w:hideMark/>
+          </w:tcPr>
+          <w:p>
+            <w:pPr>
+              <w:tabs>
+                <w:tab w:val="left" w:pos="2610"/>
+              </w:tabs>
+              <w:spacing w:after="200" w:line="276" w:lineRule="auto"/>
+            </w:pPr>
+            <w:r>
+              <w:t>A</w:t>
+            </w:r>
+          </w:p>
+        </w:tc>
+        <w:tc>
+          <w:tcPr>
+            <w:tcW w:w="0" w:type="auto"/>
+            <w:hideMark/>
+          </w:tcPr>
+          <w:p>
+            <w:pPr>
+              <w:tabs>
+                <w:tab w:val="left" w:pos="2610"/>
+              </w:tabs>
+              <w:spacing w:after="200" w:line="276" w:lineRule="auto"/>
+              <w:cnfStyle w:val="000000000000" w:firstRow="0" w:lastRow="0" w:firstColumn="0" w:lastColumn="0" w:oddVBand="0" w:evenVBand="0" w:oddHBand="0" w:evenHBand="0" w:firstRowFirstColumn="0" w:firstRowLastColumn="0" w:lastRowFirstColumn="0" w:lastRowLastColumn="0"/>
+            </w:pPr>
+            <w:r>
+              <w:t>Premature atrial contraction</w:t>
+            </w:r>
+          </w:p>
+        </w:tc>
+        <w:tc>
+          <w:tcPr>
+            <w:tcW w:w="0" w:type="auto"/>
+            <w:hideMark/>
+          </w:tcPr>
+          <w:p>
+            <w:pPr>
+              <w:tabs>
+                <w:tab w:val="left" w:pos="2610"/>
+              </w:tabs>
+              <w:spacing w:after="200" w:line="276" w:lineRule="auto"/>
+              <w:cnfStyle w:val="000000000000" w:firstRow="0" w:lastRow="0" w:firstColumn="0" w:lastColumn="0" w:oddVBand="0" w:evenVBand="0" w:oddHBand="0" w:evenHBand="0" w:firstRowFirstColumn="0" w:firstRowLastColumn="0" w:lastRowFirstColumn="0" w:lastRowLastColumn="0"/>
+            </w:pPr>
+            <w:r>
+              <w:t>2,546</w:t>
+            </w:r>
+          </w:p>
+        </w:tc>
+      </w:tr>
+      <w:tr>
+        <w:trPr>
+          <w:cnfStyle w:val="000000100000" w:firstRow="0" w:lastRow="0" w:firstColumn="0" w:lastColumn="0" w:oddVBand="0" w:evenVBand="0" w:oddHBand="1" w:evenHBand="0" w:firstRowFirstColumn="0" w:firstRowLastColumn="0" w:lastRowFirstColumn="0" w:lastRowLastColumn="0"/>
+        </w:trPr>
+        <w:tc>
+          <w:tcPr>
+            <w:cnfStyle w:val="001000000000" w:firstRow="0" w:lastRow="0" w:firstColumn="1" w:lastColumn="0" w:oddVBand="0" w:evenVBand="0" w:oddHBand="0" w:evenHBand="0" w:firstRowFirstColumn="0" w:firstRowLastColumn="0" w:lastRowFirstColumn="0" w:lastRowLastColumn="0"/>
+            <w:tcW w:w="0" w:type="auto"/>
+            <w:hideMark/>
+          </w:tcPr>
+          <w:p>
+            <w:pPr>
+              <w:tabs>
+                <w:tab w:val="left" w:pos="2610"/>
+              </w:tabs>
+              <w:spacing w:after="200" w:line="276" w:lineRule="auto"/>
+            </w:pPr>
+            <w:r>
+              <w:t>F</w:t>
+            </w:r>
+          </w:p>
+        </w:tc>
+        <w:tc>
+          <w:tcPr>
+            <w:tcW w:w="0" w:type="auto"/>
+            <w:hideMark/>
+          </w:tcPr>
+          <w:p>
+            <w:pPr>
+              <w:tabs>
+                <w:tab w:val="left" w:pos="2610"/>
+              </w:tabs>
+              <w:spacing w:after="200" w:line="276" w:lineRule="auto"/>
+              <w:cnfStyle w:val="000000100000" w:firstRow="0" w:lastRow="0" w:firstColumn="0" w:lastColumn="0" w:oddVBand="0" w:evenVBand="0" w:oddHBand="1" w:evenHBand="0" w:firstRowFirstColumn="0" w:firstRowLastColumn="0" w:lastRowFirstColumn="0" w:lastRowLastColumn="0"/>
+            </w:pPr>
+            <w:r>
+              <w:t>Fusion of ventricular and normal</w:t>
+            </w:r>
+          </w:p>
+        </w:tc>
+        <w:tc>
+          <w:tcPr>
+            <w:tcW w:w="0" w:type="auto"/>
+            <w:hideMark/>
+          </w:tcPr>
+          <w:p>
+            <w:pPr>
+              <w:tabs>
+                <w:tab w:val="left" w:pos="2610"/>
+              </w:tabs>
+              <w:spacing w:after="200" w:line="276" w:lineRule="auto"/>
+              <w:cnfStyle w:val="000000100000" w:firstRow="0" w:lastRow="0" w:firstColumn="0" w:lastColumn="0" w:oddVBand="0" w:evenVBand="0" w:oddHBand="1" w:evenHBand="0" w:firstRowFirstColumn="0" w:firstRowLastColumn="0" w:lastRowFirstColumn="0" w:lastRowLastColumn="0"/>
+            </w:pPr>
+            <w:r>
+              <w:t>803</w:t>
+            </w:r>
+          </w:p>
+        </w:tc>
+      </w:tr>
+      <w:tr>
+        <w:tc>
+          <w:tcPr>
+            <w:cnfStyle w:val="001000000000" w:firstRow="0" w:lastRow="0" w:firstColumn="1" w:lastColumn="0" w:oddVBand="0" w:evenVBand="0" w:oddHBand="0" w:evenHBand="0" w:firstRowFirstColumn="0" w:firstRowLastColumn="0" w:lastRowFirstColumn="0" w:lastRowLastColumn="0"/>
+            <w:tcW w:w="0" w:type="auto"/>
+            <w:hideMark/>
+          </w:tcPr>
+          <w:p>
+            <w:pPr>
+              <w:tabs>
+                <w:tab w:val="left" w:pos="2610"/>
+              </w:tabs>
+              <w:spacing w:after="200" w:line="276" w:lineRule="auto"/>
+            </w:pPr>
+            <w:r>
+              <w:t>E</w:t>
+            </w:r>
+          </w:p>
+        </w:tc>
+        <w:tc>
+          <w:tcPr>
+            <w:tcW w:w="0" w:type="auto"/>
+            <w:hideMark/>
+          </w:tcPr>
+          <w:p>
+            <w:pPr>
+              <w:tabs>
+                <w:tab w:val="left" w:pos="2610"/>
+              </w:tabs>
+              <w:spacing w:after="200" w:line="276" w:lineRule="auto"/>
+              <w:cnfStyle w:val="000000000000" w:firstRow="0" w:lastRow="0" w:firstColumn="0" w:lastColumn="0" w:oddVBand="0" w:evenVBand="0" w:oddHBand="0" w:evenHBand="0" w:firstRowFirstColumn="0" w:firstRowLastColumn="0" w:lastRowFirstColumn="0" w:lastRowLastColumn="0"/>
+            </w:pPr>
+            <w:r>
+              <w:t>Ventricular escape beat</w:t>
+            </w:r>
+          </w:p>
+        </w:tc>
+        <w:tc>
+          <w:tcPr>
+            <w:tcW w:w="0" w:type="auto"/>
+            <w:hideMark/>
+          </w:tcPr>
+          <w:p>
+            <w:pPr>
+              <w:tabs>
+                <w:tab w:val="left" w:pos="2610"/>
+              </w:tabs>
+              <w:spacing w:after="200" w:line="276" w:lineRule="auto"/>
+              <w:cnfStyle w:val="000000000000" w:firstRow="0" w:lastRow="0" w:firstColumn="0" w:lastColumn="0" w:oddVBand="0" w:evenVBand="0" w:oddHBand="0" w:evenHBand="0" w:firstRowFirstColumn="0" w:firstRowLastColumn="0" w:lastRowFirstColumn="0" w:lastRowLastColumn="0"/>
+            </w:pPr>
+            <w:r>
+              <w:t>106</w:t>
+            </w:r>
+          </w:p>
+        </w:tc>
+      </w:tr>
+    </w:tbl>
+    <w:p>
+      <w:pPr>
+        <w:tabs>
+          <w:tab w:val="left" w:pos="2610"/>
+        </w:tabs>
+      </w:pPr>
+    </w:p>
+    <w:p>
+      <w:pPr>
+        <w:tabs>
+          <w:tab w:val="left" w:pos="2610"/>
+        </w:tabs>
+        <w:rPr>
+          <w:rStyle w:val="IntenseEmphasis"/>
+        </w:rPr>
+      </w:pPr>
+      <w:r>
+        <w:rPr>
+          <w:rStyle w:val="IntenseEmphasis"/>
+        </w:rPr>
+        <w:t>Why did we save in parquet format and why not a regular .csv?</w:t>
+      </w:r>
+    </w:p>
+    <w:p>
+      <w:pPr>
+        <w:pStyle w:val="ListParagraph"/>
+      </w:pPr>
+      <w:r>
+        <w:t>Parquet is a compressed binary format. Loading the records directly from parquet takes about ~10x less time than streaming from PhysioNet every time.</w:t>
+      </w:r>
+    </w:p>
+    <w:p>
+      <w:pPr>
+        <w:pStyle w:val="ListParagraph"/>
+      </w:pPr>
+      <w:r>
+        <w:t xml:space="preserve">The rest of the process is exactly the same just that we are scaling up this time. Loading the dataset is now easier and much faster, all thanks to parquet. The feature engineering, model training and testing across all three (Isolation Forest, </w:t>
+      </w:r>
+      <w:proofErr w:type="spellStart"/>
+      <w:r>
+        <w:t>AutoEncoder</w:t>
+      </w:r>
+      <w:proofErr w:type="spellEnd"/>
+      <w:r>
+        <w:t xml:space="preserve"> and Ensemble) models remains the same. While reviewing the metrics for evaluation I recalled something which I’ve studied and understood a long time ago but never got to learn their application as in how those fundamentals are being utilized.</w:t>
+      </w:r>
+    </w:p>
+    <w:p>
+      <w:pPr>
+        <w:tabs>
+          <w:tab w:val="left" w:pos="2610"/>
+        </w:tabs>
+        <w:rPr>
+          <w:rStyle w:val="IntenseEmphasis"/>
+        </w:rPr>
+      </w:pPr>
+      <w:r>
+        <w:rPr>
+          <w:rStyle w:val="IntenseEmphasis"/>
+        </w:rPr>
+        <w:t>What is this PR-curve and ROC curve?</w:t>
+      </w:r>
+    </w:p>
+    <w:p>
+      <w:pPr>
+        <w:pStyle w:val="ListParagraph"/>
+      </w:pPr>
+      <w:r>
+        <w:t xml:space="preserve">As I mentioned, I recall this 68:95:99 rule which is the fundamental rule of normal distribution. It means: </w:t>
+      </w:r>
+    </w:p>
+    <w:p>
+      <w:pPr>
+        <w:pStyle w:val="ListParagraph"/>
+        <w:numPr>
+          <w:ilvl w:val="0"/>
+          <w:numId w:val="10"/>
+        </w:numPr>
+      </w:pPr>
+      <w:r>
+        <w:t>68% of data falls within 1 standard deviation of the mean</w:t>
+      </w:r>
+    </w:p>
+    <w:p>
+      <w:pPr>
+        <w:pStyle w:val="ListParagraph"/>
+        <w:numPr>
+          <w:ilvl w:val="0"/>
+          <w:numId w:val="10"/>
+        </w:numPr>
+      </w:pPr>
+      <w:r>
+        <w:t>95% falls within 2 standard deviations</w:t>
+      </w:r>
+    </w:p>
+    <w:p>
+      <w:pPr>
+        <w:pStyle w:val="ListParagraph"/>
+        <w:numPr>
+          <w:ilvl w:val="0"/>
+          <w:numId w:val="10"/>
+        </w:numPr>
+      </w:pPr>
+      <w:r>
+        <w:t>99.7% falls within 3 standard deviations</w:t>
+      </w:r>
+    </w:p>
+    <w:p>
+      <w:pPr>
+        <w:tabs>
+          <w:tab w:val="left" w:pos="2610"/>
+        </w:tabs>
+      </w:pPr>
+      <w:r>
+        <w:t>Before I move to the explanation of PR-curve and ROC curve I wanted to introduce another most important topic of infamously famous matrix i.e., the “</w:t>
+      </w:r>
+      <w:r>
+        <w:rPr>
+          <w:b/>
+          <w:bCs/>
+        </w:rPr>
+        <w:t>Confusion Matrix</w:t>
+      </w:r>
+      <w:r>
+        <w:t xml:space="preserve">”. </w:t>
+      </w:r>
+    </w:p>
+    <w:p>
+      <w:pPr>
+        <w:tabs>
+          <w:tab w:val="left" w:pos="2610"/>
+        </w:tabs>
+      </w:pPr>
+      <w:r>
+        <w:t>Let me take up an example to better explain the confusion matrix just to avoid any confusion:</w:t>
+      </w:r>
+    </w:p>
+    <w:p>
+      <w:pPr>
+        <w:pStyle w:val="ListParagraph"/>
+      </w:pPr>
+      <w:r>
+        <w:t>Imagine there is a model that looks at about 100 beats. Out of which 10 are genuinely abnormal and remaining 90 are genuinely normal. Now, there are four major outcomes you need to be aware of what they mean.</w:t>
+      </w:r>
+    </w:p>
+    <w:p>
+      <w:pPr>
+        <w:pStyle w:val="ListParagraph"/>
+      </w:pPr>
+      <w:r>
+        <w:rPr>
+          <w:b/>
+          <w:bCs/>
+        </w:rPr>
+        <w:t>True Positive (TP)</w:t>
+      </w:r>
+      <w:r>
+        <w:t xml:space="preserve"> </w:t>
       </w:r>
       <w:r>
         <w:t>–</w:t>
       </w:r>
       <w:r>
-        <w:t xml:space="preserve"> more patients, an improved Autoencoder, and a threshold that adapts to each individual's baseline rather than the training </w:t>
-      </w:r>
-      <w:r>
-        <w:t>populations</w:t>
-      </w:r>
-      <w:r>
-        <w:t>. The architecture is ready. The understanding is there. What remains is building it.</w:t>
-      </w:r>
+        <w:t xml:space="preserve"> model said anomaly, it was genuinely anomaly. Correct alarm. This is what you want to maximise.</w:t>
+      </w:r>
+    </w:p>
+    <w:p>
+      <w:pPr>
+        <w:pStyle w:val="ListParagraph"/>
+      </w:pPr>
+      <w:r>
+        <w:rPr>
+          <w:b/>
+          <w:bCs/>
+        </w:rPr>
+        <w:t>True Negative (TN)</w:t>
+      </w:r>
+      <w:r>
+        <w:t xml:space="preserve"> </w:t>
+      </w:r>
+      <w:r>
+        <w:t>–</w:t>
+      </w:r>
+      <w:r>
+        <w:t xml:space="preserve"> model said normal, it was genuinely normal. Correct silence.</w:t>
+      </w:r>
+    </w:p>
+    <w:p>
+      <w:pPr>
+        <w:pStyle w:val="ListParagraph"/>
+      </w:pPr>
+      <w:r>
+        <w:rPr>
+          <w:b/>
+          <w:bCs/>
+        </w:rPr>
+        <w:t>False Positive (FP)</w:t>
+      </w:r>
+      <w:r>
+        <w:t xml:space="preserve"> </w:t>
+      </w:r>
+      <w:r>
+        <w:t>–</w:t>
+      </w:r>
+      <w:r>
+        <w:t xml:space="preserve"> model said anomaly, it was actually normal. False alarm. Costs clinician time and trust.</w:t>
+      </w:r>
+    </w:p>
+    <w:p>
+      <w:pPr>
+        <w:pStyle w:val="ListParagraph"/>
+      </w:pPr>
+      <w:r>
+        <w:rPr>
+          <w:b/>
+          <w:bCs/>
+        </w:rPr>
+        <w:t>False Negative (FN)</w:t>
+      </w:r>
+      <w:r>
+        <w:t xml:space="preserve"> </w:t>
+      </w:r>
+      <w:r>
+        <w:t>–</w:t>
+      </w:r>
+      <w:r>
+        <w:t xml:space="preserve"> model said normal, it was actually anomaly. Missed detection. The most dangerous error in healthcare. A patient goes unmonitored.</w:t>
+      </w:r>
+    </w:p>
+    <w:tbl>
+      <w:tblPr>
+        <w:tblStyle w:val="TableGrid"/>
+        <w:tblW w:w="9164" w:type="dxa"/>
+        <w:tblLook w:val="04A0" w:firstRow="1" w:lastRow="0" w:firstColumn="1" w:lastColumn="0" w:noHBand="0" w:noVBand="1"/>
+      </w:tblPr>
+      <w:tblGrid>
+        <w:gridCol w:w="3054"/>
+        <w:gridCol w:w="3054"/>
+        <w:gridCol w:w="3056"/>
+      </w:tblGrid>
+      <w:tr>
+        <w:trPr>
+          <w:trHeight w:val="364"/>
+        </w:trPr>
+        <w:tc>
+          <w:tcPr>
+            <w:tcW w:w="3054" w:type="dxa"/>
+          </w:tcPr>
+          <w:p>
+            <w:pPr>
+              <w:tabs>
+                <w:tab w:val="left" w:pos="2610"/>
+              </w:tabs>
+            </w:pPr>
+          </w:p>
+        </w:tc>
+        <w:tc>
+          <w:tcPr>
+            <w:tcW w:w="3054" w:type="dxa"/>
+          </w:tcPr>
+          <w:p>
+            <w:pPr>
+              <w:tabs>
+                <w:tab w:val="left" w:pos="2610"/>
+              </w:tabs>
+            </w:pPr>
+            <w:r>
+              <w:t>Model says NORMAL</w:t>
+            </w:r>
+          </w:p>
+        </w:tc>
+        <w:tc>
+          <w:tcPr>
+            <w:tcW w:w="3056" w:type="dxa"/>
+          </w:tcPr>
+          <w:p>
+            <w:pPr>
+              <w:tabs>
+                <w:tab w:val="left" w:pos="2610"/>
+              </w:tabs>
+            </w:pPr>
+            <w:r>
+              <w:t>Model says ABNORMAL</w:t>
+            </w:r>
+          </w:p>
+        </w:tc>
+      </w:tr>
+      <w:tr>
+        <w:trPr>
+          <w:trHeight w:val="364"/>
+        </w:trPr>
+        <w:tc>
+          <w:tcPr>
+            <w:tcW w:w="3054" w:type="dxa"/>
+          </w:tcPr>
+          <w:p>
+            <w:pPr>
+              <w:tabs>
+                <w:tab w:val="left" w:pos="2610"/>
+              </w:tabs>
+            </w:pPr>
+            <w:r>
+              <w:t>Actually NORMAL</w:t>
+            </w:r>
+          </w:p>
+        </w:tc>
+        <w:tc>
+          <w:tcPr>
+            <w:tcW w:w="3054" w:type="dxa"/>
+          </w:tcPr>
+          <w:p>
+            <w:pPr>
+              <w:tabs>
+                <w:tab w:val="left" w:pos="2610"/>
+              </w:tabs>
+            </w:pPr>
+            <w:r>
+              <w:t>TN = 85</w:t>
+            </w:r>
+          </w:p>
+        </w:tc>
+        <w:tc>
+          <w:tcPr>
+            <w:tcW w:w="3056" w:type="dxa"/>
+          </w:tcPr>
+          <w:p>
+            <w:pPr>
+              <w:tabs>
+                <w:tab w:val="left" w:pos="2610"/>
+              </w:tabs>
+            </w:pPr>
+            <w:r>
+              <w:t>FP = 5</w:t>
+            </w:r>
+          </w:p>
+        </w:tc>
+      </w:tr>
+      <w:tr>
+        <w:trPr>
+          <w:trHeight w:val="381"/>
+        </w:trPr>
+        <w:tc>
+          <w:tcPr>
+            <w:tcW w:w="3054" w:type="dxa"/>
+          </w:tcPr>
+          <w:p>
+            <w:pPr>
+              <w:tabs>
+                <w:tab w:val="left" w:pos="2610"/>
+              </w:tabs>
+            </w:pPr>
+            <w:r>
+              <w:t>Actually ABNORMAL</w:t>
+            </w:r>
+          </w:p>
+        </w:tc>
+        <w:tc>
+          <w:tcPr>
+            <w:tcW w:w="3054" w:type="dxa"/>
+          </w:tcPr>
+          <w:p>
+            <w:pPr>
+              <w:tabs>
+                <w:tab w:val="left" w:pos="2610"/>
+              </w:tabs>
+            </w:pPr>
+            <w:r>
+              <w:t>FN = 3</w:t>
+            </w:r>
+          </w:p>
+        </w:tc>
+        <w:tc>
+          <w:tcPr>
+            <w:tcW w:w="3056" w:type="dxa"/>
+          </w:tcPr>
+          <w:p>
+            <w:pPr>
+              <w:tabs>
+                <w:tab w:val="left" w:pos="2610"/>
+              </w:tabs>
+            </w:pPr>
+            <w:r>
+              <w:t>TP = 7</w:t>
+            </w:r>
+          </w:p>
+        </w:tc>
+      </w:tr>
+    </w:tbl>
+    <w:p>
+      <w:pPr>
+        <w:tabs>
+          <w:tab w:val="left" w:pos="2610"/>
+        </w:tabs>
+      </w:pPr>
+    </w:p>
+    <w:p>
+      <w:pPr>
+        <w:tabs>
+          <w:tab w:val="left" w:pos="2610"/>
+        </w:tabs>
+      </w:pPr>
+      <w:r>
+        <w:t xml:space="preserve">The key take away from this concept is that you always ensure to have </w:t>
+      </w:r>
+      <w:r>
+        <w:rPr>
+          <w:b/>
+          <w:bCs/>
+        </w:rPr>
+        <w:t>HIGHER</w:t>
+      </w:r>
+      <w:r>
+        <w:t xml:space="preserve"> True Positive (TP) and True Negative (TN) and keeping the False Positive (FP) and False Negative (FN) at the </w:t>
+      </w:r>
+      <w:r>
+        <w:rPr>
+          <w:b/>
+          <w:bCs/>
+        </w:rPr>
+        <w:t>lowest</w:t>
+      </w:r>
+      <w:r>
+        <w:t xml:space="preserve"> point possible as they are extremely dangerous </w:t>
+      </w:r>
+      <w:r>
+        <w:t xml:space="preserve">in the field of healthcare. </w:t>
+      </w:r>
+    </w:p>
+    <w:p>
+      <w:pPr>
+        <w:tabs>
+          <w:tab w:val="left" w:pos="2610"/>
+        </w:tabs>
+        <w:rPr>
+          <w:rStyle w:val="IntenseEmphasis"/>
+        </w:rPr>
+      </w:pPr>
+    </w:p>
+    <w:p>
+      <w:pPr>
+        <w:tabs>
+          <w:tab w:val="left" w:pos="2610"/>
+        </w:tabs>
+        <w:rPr>
+          <w:rStyle w:val="IntenseEmphasis"/>
+        </w:rPr>
+      </w:pPr>
+    </w:p>
+    <w:p>
+      <w:pPr>
+        <w:tabs>
+          <w:tab w:val="left" w:pos="2610"/>
+        </w:tabs>
+        <w:rPr>
+          <w:rStyle w:val="IntenseEmphasis"/>
+        </w:rPr>
+      </w:pPr>
+    </w:p>
+    <w:p>
+      <w:pPr>
+        <w:tabs>
+          <w:tab w:val="left" w:pos="2610"/>
+        </w:tabs>
+        <w:rPr>
+          <w:rStyle w:val="IntenseEmphasis"/>
+        </w:rPr>
+      </w:pPr>
+      <w:r>
+        <w:rPr>
+          <w:rStyle w:val="IntenseEmphasis"/>
+        </w:rPr>
+        <w:lastRenderedPageBreak/>
+        <w:t>Now why do we have the tension between the Precision and the Recall?</w:t>
+      </w:r>
+    </w:p>
+    <w:p>
+      <w:pPr>
+        <w:pStyle w:val="ListParagraph"/>
+      </w:pPr>
+      <w:r>
+        <w:t xml:space="preserve">These two factors are always in direct conflict. It is never easy to maximize both simultaneously. Think of this like a </w:t>
+      </w:r>
+      <w:r>
+        <w:rPr>
+          <w:b/>
+          <w:bCs/>
+        </w:rPr>
+        <w:t>DEADLOCK</w:t>
+      </w:r>
+      <w:r>
+        <w:t xml:space="preserve"> situation in your OS. There are 2 processors trying to fetch the same single resource. If one gets the access the other doesn’t and vice versa. If Recall goes high, precision dips and vice versa.</w:t>
+      </w:r>
+    </w:p>
+    <w:p>
+      <w:pPr>
+        <w:tabs>
+          <w:tab w:val="left" w:pos="2610"/>
+        </w:tabs>
+      </w:pPr>
+      <w:r>
+        <w:t xml:space="preserve">This is why </w:t>
+      </w:r>
+      <w:proofErr w:type="spellStart"/>
+      <w:r>
+        <w:t>VitalWatch's</w:t>
+      </w:r>
+      <w:proofErr w:type="spellEnd"/>
+      <w:r>
+        <w:t xml:space="preserve"> signal dilution finding matters. </w:t>
+      </w:r>
+      <w:r>
+        <w:rPr>
+          <w:u w:val="single"/>
+        </w:rPr>
+        <w:t>LSTM had high precision and low recall</w:t>
+      </w:r>
+      <w:r>
+        <w:t>. Autoencoder had high recall and low precision. Neither alone is clinically acceptable. The ensemble is the attempt to find the right balance.</w:t>
+      </w:r>
+    </w:p>
+    <w:p>
+      <w:pPr>
+        <w:tabs>
+          <w:tab w:val="left" w:pos="2610"/>
+        </w:tabs>
+      </w:pPr>
+      <w:r>
+        <w:t>The Precision-Recall curve visualises this trade-off across every possible threshold simultaneously.</w:t>
+      </w:r>
+    </w:p>
+    <w:p>
+      <w:pPr>
+        <w:tabs>
+          <w:tab w:val="left" w:pos="2610"/>
+        </w:tabs>
+        <w:rPr>
+          <w:rStyle w:val="IntenseEmphasis"/>
+        </w:rPr>
+      </w:pPr>
+      <w:r>
+        <w:rPr>
+          <w:rStyle w:val="IntenseEmphasis"/>
+        </w:rPr>
+        <w:t>How is it built then?</w:t>
+      </w:r>
+    </w:p>
+    <w:p>
+      <w:pPr>
+        <w:tabs>
+          <w:tab w:val="left" w:pos="2610"/>
+        </w:tabs>
+      </w:pPr>
+      <w:r>
+        <w:t>Instead of picking one threshold and getting one pair of precision/recall values, you sweep through every possible threshold from 0 to 1. At each threshold you calculate one (precision, recall) pair. You plot all those pairs as a curve.</w:t>
+      </w:r>
+    </w:p>
+    <w:p>
+      <w:pPr>
+        <w:tabs>
+          <w:tab w:val="left" w:pos="2610"/>
+        </w:tabs>
+        <w:spacing w:after="0"/>
+      </w:pPr>
+      <w:r>
+        <w:t>Precision</w:t>
+      </w:r>
+    </w:p>
+    <w:p>
+      <w:pPr>
+        <w:tabs>
+          <w:tab w:val="left" w:pos="2610"/>
+        </w:tabs>
+        <w:spacing w:after="0"/>
+        <w:ind w:left="284"/>
+      </w:pPr>
+      <w:r>
+        <w:t xml:space="preserve"> |</w:t>
+      </w:r>
+    </w:p>
+    <w:p>
+      <w:pPr>
+        <w:tabs>
+          <w:tab w:val="left" w:pos="2610"/>
+        </w:tabs>
+        <w:spacing w:after="0"/>
+      </w:pPr>
+      <w:r>
+        <w:t>1.0 |  *</w:t>
+      </w:r>
+    </w:p>
+    <w:p>
+      <w:pPr>
+        <w:tabs>
+          <w:tab w:val="left" w:pos="2610"/>
+        </w:tabs>
+        <w:spacing w:after="0"/>
+        <w:ind w:left="284"/>
+      </w:pPr>
+      <w:r>
+        <w:t xml:space="preserve"> |    </w:t>
+      </w:r>
+      <w:r>
+        <w:t xml:space="preserve">  </w:t>
+      </w:r>
+      <w:r>
+        <w:t xml:space="preserve"> *</w:t>
+      </w:r>
+    </w:p>
+    <w:p>
+      <w:pPr>
+        <w:tabs>
+          <w:tab w:val="left" w:pos="2610"/>
+        </w:tabs>
+        <w:spacing w:after="0"/>
+      </w:pPr>
+      <w:r>
+        <w:t xml:space="preserve">0.8 |      </w:t>
+      </w:r>
+      <w:r>
+        <w:t xml:space="preserve">   </w:t>
+      </w:r>
+      <w:r>
+        <w:t xml:space="preserve">   *</w:t>
+      </w:r>
+    </w:p>
+    <w:p>
+      <w:pPr>
+        <w:tabs>
+          <w:tab w:val="left" w:pos="2610"/>
+        </w:tabs>
+        <w:spacing w:after="0"/>
+        <w:ind w:left="284"/>
+      </w:pPr>
+      <w:r>
+        <w:t xml:space="preserve"> |          </w:t>
+      </w:r>
+      <w:r>
+        <w:t xml:space="preserve">  </w:t>
+      </w:r>
+      <w:r>
+        <w:t xml:space="preserve">   *</w:t>
+      </w:r>
+    </w:p>
+    <w:p>
+      <w:pPr>
+        <w:tabs>
+          <w:tab w:val="left" w:pos="2610"/>
+        </w:tabs>
+        <w:spacing w:after="0"/>
+      </w:pPr>
+      <w:r>
+        <w:t xml:space="preserve">0.6 |             </w:t>
+      </w:r>
+      <w:r>
+        <w:t xml:space="preserve"> </w:t>
+      </w:r>
+      <w:r>
+        <w:t xml:space="preserve"> </w:t>
+      </w:r>
+      <w:r>
+        <w:t xml:space="preserve"> </w:t>
+      </w:r>
+      <w:r>
+        <w:t xml:space="preserve">  *</w:t>
+      </w:r>
+    </w:p>
+    <w:p>
+      <w:pPr>
+        <w:tabs>
+          <w:tab w:val="left" w:pos="2610"/>
+        </w:tabs>
+        <w:spacing w:after="0"/>
+        <w:ind w:left="284"/>
+      </w:pPr>
+      <w:r>
+        <w:t xml:space="preserve"> |                 </w:t>
+      </w:r>
+      <w:r>
+        <w:t xml:space="preserve">  </w:t>
+      </w:r>
+      <w:r>
+        <w:t xml:space="preserve">    *</w:t>
+      </w:r>
+    </w:p>
+    <w:p>
+      <w:pPr>
+        <w:tabs>
+          <w:tab w:val="left" w:pos="2610"/>
+        </w:tabs>
+        <w:spacing w:after="0"/>
+      </w:pPr>
+      <w:r>
+        <w:t xml:space="preserve">0.4 |                      </w:t>
+      </w:r>
+      <w:r>
+        <w:t xml:space="preserve">  </w:t>
+      </w:r>
+      <w:r>
+        <w:t xml:space="preserve">  </w:t>
+      </w:r>
+      <w:r>
+        <w:t xml:space="preserve"> </w:t>
+      </w:r>
+      <w:r>
+        <w:t xml:space="preserve">  *</w:t>
+      </w:r>
+    </w:p>
+    <w:p>
+      <w:pPr>
+        <w:tabs>
+          <w:tab w:val="left" w:pos="2610"/>
+        </w:tabs>
+        <w:spacing w:after="0"/>
+        <w:ind w:left="284"/>
+      </w:pPr>
+      <w:r>
+        <w:t xml:space="preserve"> |                          </w:t>
+      </w:r>
+      <w:r>
+        <w:t xml:space="preserve"> </w:t>
+      </w:r>
+      <w:r>
+        <w:t xml:space="preserve">   </w:t>
+      </w:r>
+      <w:r>
+        <w:t xml:space="preserve"> </w:t>
+      </w:r>
+      <w:r>
+        <w:t xml:space="preserve">  </w:t>
+      </w:r>
+      <w:r>
+        <w:t xml:space="preserve"> </w:t>
+      </w:r>
+      <w:r>
+        <w:t xml:space="preserve"> *</w:t>
+      </w:r>
+    </w:p>
+    <w:p>
+      <w:pPr>
+        <w:tabs>
+          <w:tab w:val="left" w:pos="2610"/>
+        </w:tabs>
+        <w:spacing w:after="0"/>
+      </w:pPr>
+      <w:r>
+        <w:t xml:space="preserve">0.2 |                                 </w:t>
+      </w:r>
+      <w:r>
+        <w:t xml:space="preserve"> </w:t>
+      </w:r>
+      <w:r>
+        <w:t xml:space="preserve">   </w:t>
+      </w:r>
+      <w:r>
+        <w:t xml:space="preserve"> </w:t>
+      </w:r>
+      <w:r>
+        <w:t xml:space="preserve">  </w:t>
+      </w:r>
+      <w:r>
+        <w:t xml:space="preserve"> </w:t>
+      </w:r>
+      <w:r>
+        <w:t xml:space="preserve"> *</w:t>
+      </w:r>
+    </w:p>
+    <w:p>
+      <w:pPr>
+        <w:tabs>
+          <w:tab w:val="left" w:pos="2610"/>
+        </w:tabs>
+        <w:spacing w:after="0"/>
+        <w:ind w:left="284"/>
+      </w:pPr>
+      <w:r>
+        <w:t xml:space="preserve"> |_____________________________</w:t>
+      </w:r>
+    </w:p>
+    <w:p>
+      <w:pPr>
+        <w:tabs>
+          <w:tab w:val="left" w:pos="2610"/>
+        </w:tabs>
+        <w:spacing w:after="0"/>
+        <w:ind w:left="284"/>
+      </w:pPr>
+      <w:r>
+        <w:t xml:space="preserve">0.2  </w:t>
+      </w:r>
+      <w:r>
+        <w:t xml:space="preserve">  </w:t>
+      </w:r>
+      <w:r>
+        <w:t xml:space="preserve">0.4  </w:t>
+      </w:r>
+      <w:r>
+        <w:t xml:space="preserve">  </w:t>
+      </w:r>
+      <w:r>
+        <w:t xml:space="preserve">0.6  </w:t>
+      </w:r>
+      <w:r>
+        <w:t xml:space="preserve">  </w:t>
+      </w:r>
+      <w:r>
+        <w:t xml:space="preserve">0.8  </w:t>
+      </w:r>
+      <w:r>
+        <w:t xml:space="preserve">  </w:t>
+      </w:r>
+      <w:r>
+        <w:t xml:space="preserve">1.0  </w:t>
+      </w:r>
+      <w:r>
+        <w:t xml:space="preserve">  </w:t>
+      </w:r>
+      <w:r>
+        <w:t xml:space="preserve"> Recall</w:t>
+      </w:r>
+    </w:p>
+    <w:p>
+      <w:pPr>
+        <w:tabs>
+          <w:tab w:val="left" w:pos="2610"/>
+        </w:tabs>
+        <w:spacing w:after="0"/>
+        <w:ind w:left="284"/>
+      </w:pPr>
+    </w:p>
+    <w:p>
+      <w:pPr>
+        <w:tabs>
+          <w:tab w:val="left" w:pos="2610"/>
+        </w:tabs>
+        <w:spacing w:after="0"/>
+      </w:pPr>
+      <w:r>
+        <w:t xml:space="preserve">The area under this curve is called </w:t>
+      </w:r>
+      <w:r>
+        <w:rPr>
+          <w:b/>
+          <w:bCs/>
+        </w:rPr>
+        <w:t>Average Precision (AP)</w:t>
+      </w:r>
+      <w:r>
+        <w:t xml:space="preserve"> or sometimes </w:t>
+      </w:r>
+      <w:r>
+        <w:rPr>
+          <w:b/>
+          <w:bCs/>
+        </w:rPr>
+        <w:t>PR-AUC</w:t>
+      </w:r>
+      <w:r>
+        <w:t>. Higher is better.</w:t>
+      </w:r>
+    </w:p>
+    <w:p>
+      <w:pPr>
+        <w:tabs>
+          <w:tab w:val="left" w:pos="2610"/>
+        </w:tabs>
+        <w:spacing w:after="0"/>
+      </w:pPr>
+    </w:p>
+    <w:p>
+      <w:pPr>
+        <w:tabs>
+          <w:tab w:val="left" w:pos="2610"/>
+        </w:tabs>
+      </w:pPr>
+      <w:r>
+        <w:rPr>
+          <w:b/>
+          <w:bCs/>
+        </w:rPr>
+        <w:t>The ROC Curve and AUC</w:t>
+      </w:r>
+    </w:p>
+    <w:p>
+      <w:pPr>
+        <w:tabs>
+          <w:tab w:val="left" w:pos="2610"/>
+        </w:tabs>
+      </w:pPr>
+      <w:r>
+        <w:t xml:space="preserve">ROC stands for Receiver Operating Characteristic. It comes from radar detection theory in World War II </w:t>
+      </w:r>
+      <w:r>
+        <w:t>–</w:t>
+      </w:r>
+      <w:r>
+        <w:t xml:space="preserve"> operators had to decide whether a radar signal indicated an enemy aircraft or noise. Same trade-off, different domain.</w:t>
+      </w:r>
+    </w:p>
+    <w:p>
+      <w:pPr>
+        <w:tabs>
+          <w:tab w:val="left" w:pos="2610"/>
+        </w:tabs>
+      </w:pPr>
+      <w:r>
+        <w:t>The ROC curve plots two different quantities:</w:t>
+      </w:r>
+    </w:p>
+    <w:p>
+      <w:pPr>
+        <w:tabs>
+          <w:tab w:val="left" w:pos="2610"/>
+        </w:tabs>
+      </w:pPr>
+      <w:r>
+        <w:rPr>
+          <w:b/>
+          <w:bCs/>
+        </w:rPr>
+        <w:t>True Positive Rate (TPR)</w:t>
+      </w:r>
+      <w:r>
+        <w:t xml:space="preserve"> </w:t>
+      </w:r>
+      <w:r>
+        <w:t>–</w:t>
+      </w:r>
+      <w:r>
+        <w:t xml:space="preserve"> same as Recall. How many real anomalies did we catch?</w:t>
+      </w:r>
+    </w:p>
+    <w:p>
+      <w:pPr>
+        <w:tabs>
+          <w:tab w:val="left" w:pos="2610"/>
+        </w:tabs>
+      </w:pPr>
+      <w:r>
+        <w:rPr>
+          <w:b/>
+          <w:bCs/>
+        </w:rPr>
+        <w:t>False Positive Rate (FPR)</w:t>
+      </w:r>
+      <w:r>
+        <w:t xml:space="preserve"> </w:t>
+      </w:r>
+      <w:r>
+        <w:t>–</w:t>
+      </w:r>
+      <w:r>
+        <w:t xml:space="preserve"> out of all the genuinely normal beats, how many did we incorrectly flag?</w:t>
+      </w:r>
+    </w:p>
+    <w:p>
+      <w:pPr>
+        <w:tabs>
+          <w:tab w:val="left" w:pos="2610"/>
+        </w:tabs>
+        <w:spacing w:after="0"/>
+      </w:pPr>
+    </w:p>
+    <w:p>
+      <w:pPr>
+        <w:tabs>
+          <w:tab w:val="left" w:pos="2610"/>
+        </w:tabs>
+      </w:pPr>
+    </w:p>
+    <w:p>
+      <w:pPr>
+        <w:tabs>
+          <w:tab w:val="left" w:pos="2610"/>
+        </w:tabs>
+      </w:pPr>
+    </w:p>
+    <w:p>
+      <w:pPr>
+        <w:tabs>
+          <w:tab w:val="left" w:pos="2610"/>
+        </w:tabs>
+      </w:pPr>
+      <w:r>
+        <w:lastRenderedPageBreak/>
+        <w:t>The result of this looks like this:</w:t>
+      </w:r>
+    </w:p>
+    <w:p>
+      <w:pPr>
+        <w:tabs>
+          <w:tab w:val="left" w:pos="2610"/>
+        </w:tabs>
+        <w:spacing w:after="0"/>
+        <w:ind w:left="284"/>
+      </w:pPr>
+      <w:r>
+        <w:t>TPR</w:t>
+      </w:r>
+    </w:p>
+    <w:p>
+      <w:pPr>
+        <w:tabs>
+          <w:tab w:val="left" w:pos="2610"/>
+        </w:tabs>
+        <w:spacing w:after="0"/>
+        <w:ind w:left="284"/>
+      </w:pPr>
+      <w:r>
+        <w:t xml:space="preserve"> |                  ___________</w:t>
+      </w:r>
+    </w:p>
+    <w:p>
+      <w:pPr>
+        <w:tabs>
+          <w:tab w:val="left" w:pos="2610"/>
+        </w:tabs>
+        <w:spacing w:after="0"/>
+      </w:pPr>
+      <w:r>
+        <w:t>1.0 |            __/</w:t>
+      </w:r>
+    </w:p>
+    <w:p>
+      <w:pPr>
+        <w:tabs>
+          <w:tab w:val="left" w:pos="2610"/>
+        </w:tabs>
+        <w:spacing w:after="0"/>
+        <w:ind w:left="284"/>
+      </w:pPr>
+      <w:r>
+        <w:t xml:space="preserve"> |          /</w:t>
+      </w:r>
+    </w:p>
+    <w:p>
+      <w:pPr>
+        <w:tabs>
+          <w:tab w:val="left" w:pos="2610"/>
+        </w:tabs>
+        <w:spacing w:after="0"/>
+      </w:pPr>
+      <w:r>
+        <w:t>0.8 |        /</w:t>
+      </w:r>
+    </w:p>
+    <w:p>
+      <w:pPr>
+        <w:tabs>
+          <w:tab w:val="left" w:pos="2610"/>
+        </w:tabs>
+        <w:spacing w:after="0"/>
+        <w:ind w:left="284"/>
+      </w:pPr>
+      <w:r>
+        <w:t xml:space="preserve"> |      /</w:t>
+      </w:r>
+    </w:p>
+    <w:p>
+      <w:pPr>
+        <w:tabs>
+          <w:tab w:val="left" w:pos="2610"/>
+        </w:tabs>
+        <w:spacing w:after="0"/>
+      </w:pPr>
+      <w:r>
+        <w:t>0.6 |    /</w:t>
+      </w:r>
+    </w:p>
+    <w:p>
+      <w:pPr>
+        <w:tabs>
+          <w:tab w:val="left" w:pos="2610"/>
+        </w:tabs>
+        <w:spacing w:after="0"/>
+        <w:ind w:left="284"/>
+      </w:pPr>
+      <w:r>
+        <w:t xml:space="preserve"> |  /</w:t>
+      </w:r>
+    </w:p>
+    <w:p>
+      <w:pPr>
+        <w:tabs>
+          <w:tab w:val="left" w:pos="2610"/>
+        </w:tabs>
+        <w:spacing w:after="0"/>
+      </w:pPr>
+      <w:r>
+        <w:t>0.4 |/     &lt;- random model (diagonal line)</w:t>
+      </w:r>
+    </w:p>
+    <w:p>
+      <w:pPr>
+        <w:tabs>
+          <w:tab w:val="left" w:pos="2610"/>
+        </w:tabs>
+        <w:spacing w:after="0"/>
+        <w:ind w:left="284"/>
+      </w:pPr>
+      <w:r>
+        <w:t xml:space="preserve"> |</w:t>
+      </w:r>
+    </w:p>
+    <w:p>
+      <w:pPr>
+        <w:tabs>
+          <w:tab w:val="left" w:pos="2610"/>
+        </w:tabs>
+        <w:spacing w:after="0"/>
+      </w:pPr>
+      <w:r>
+        <w:t>0.2 |</w:t>
+      </w:r>
+    </w:p>
+    <w:p>
+      <w:pPr>
+        <w:tabs>
+          <w:tab w:val="left" w:pos="2610"/>
+        </w:tabs>
+        <w:spacing w:after="0"/>
+        <w:ind w:left="284"/>
+      </w:pPr>
+      <w:r>
+        <w:t xml:space="preserve"> |_________________________________</w:t>
+      </w:r>
+    </w:p>
+    <w:p>
+      <w:pPr>
+        <w:tabs>
+          <w:tab w:val="left" w:pos="2610"/>
+        </w:tabs>
+        <w:spacing w:after="0"/>
+      </w:pPr>
+      <w:r>
+        <w:t xml:space="preserve">       0.0    0.2    0.4    0.6    0.8    1.0    FPR</w:t>
+      </w:r>
+    </w:p>
+    <w:p>
+      <w:pPr>
+        <w:tabs>
+          <w:tab w:val="left" w:pos="2610"/>
+        </w:tabs>
+        <w:spacing w:after="0"/>
+      </w:pPr>
+    </w:p>
+    <w:p>
+      <w:pPr>
+        <w:tabs>
+          <w:tab w:val="left" w:pos="2610"/>
+        </w:tabs>
+      </w:pPr>
+      <w:r>
+        <w:t xml:space="preserve">AUC has a beautiful probabilistic interpretation </w:t>
+      </w:r>
+      <w:r>
+        <w:t>–</w:t>
+      </w:r>
+      <w:r>
+        <w:t xml:space="preserve"> it is the probability that the model will rank a randomly chosen anomalous beat higher than a randomly chosen normal beat. An AUC of 0.85 means if you pick one random abnormal beat and one random normal beat, 85% of the time the model scores the abnormal one as more suspicious.</w:t>
+      </w:r>
+    </w:p>
+    <w:p>
+      <w:pPr>
+        <w:tabs>
+          <w:tab w:val="left" w:pos="2610"/>
+        </w:tabs>
+        <w:rPr>
+          <w:rStyle w:val="IntenseEmphasis"/>
+        </w:rPr>
+      </w:pPr>
+      <w:r>
+        <w:rPr>
+          <w:rStyle w:val="IntenseEmphasis"/>
+        </w:rPr>
+        <w:t>What does this graph tell us anyway?</w:t>
+      </w:r>
+    </w:p>
+    <w:p>
+      <w:pPr>
+        <w:pStyle w:val="ListParagraph"/>
+      </w:pPr>
+      <w:r>
+        <w:t xml:space="preserve">The diagonal line represents a random model </w:t>
+      </w:r>
+      <w:r>
+        <w:t>–</w:t>
+      </w:r>
+      <w:r>
+        <w:t xml:space="preserve"> </w:t>
+      </w:r>
+      <w:r>
+        <w:t>i</w:t>
+      </w:r>
+      <w:r>
+        <w:t>t has a 50/50 chance of being right, same as a coin flip. Any curve above the diagonal means the model is doing better than random.</w:t>
+      </w:r>
+    </w:p>
+    <w:p>
+      <w:pPr>
+        <w:tabs>
+          <w:tab w:val="left" w:pos="2610"/>
+        </w:tabs>
+        <w:rPr>
+          <w:rStyle w:val="IntenseEmphasis"/>
+        </w:rPr>
+      </w:pPr>
+      <w:r>
+        <w:rPr>
+          <w:rStyle w:val="IntenseEmphasis"/>
+        </w:rPr>
+        <w:t>When to use which?</w:t>
+      </w:r>
+    </w:p>
+    <w:p>
+      <w:pPr>
+        <w:pStyle w:val="ListParagraph"/>
+      </w:pPr>
+      <w:r>
+        <w:t xml:space="preserve">Both measure the same thing from different angles. For imbalanced data </w:t>
+      </w:r>
+      <w:r>
+        <w:t>–</w:t>
+      </w:r>
+      <w:r>
+        <w:t xml:space="preserve"> which is exactly our situation </w:t>
+      </w:r>
+      <w:r>
+        <w:t>–</w:t>
+      </w:r>
+      <w:r>
+        <w:t xml:space="preserve"> the PR curve is more informative.</w:t>
+      </w:r>
+    </w:p>
+    <w:p>
+      <w:pPr>
+        <w:pStyle w:val="ListParagraph"/>
+      </w:pPr>
+      <w:r>
+        <w:t>Here is why. ROC-AUC can look artificially good on imbalanced data. If your dataset has 99% normal and 1% abnormal, a model that flags everything would have a high TN count which keeps FPR low even when FP is large. The ROC curve would look decent even though the model is producing hundreds of false alarms.</w:t>
+      </w:r>
+    </w:p>
+    <w:p>
+      <w:pPr>
+        <w:pStyle w:val="ListParagraph"/>
+      </w:pPr>
+      <w:r>
+        <w:t xml:space="preserve">The PR curve is immune to this </w:t>
+      </w:r>
+      <w:r>
+        <w:t>–</w:t>
+      </w:r>
+      <w:r>
+        <w:t xml:space="preserve"> it directly measures what fraction of your alarms are real, which is exactly the clinical question.</w:t>
+      </w:r>
+    </w:p>
+    <w:p>
+      <w:pPr>
+        <w:tabs>
+          <w:tab w:val="left" w:pos="2610"/>
+        </w:tabs>
+      </w:pPr>
+      <w:r>
+        <w:t xml:space="preserve">After scaling up to all 46 records and 108,098 beats, the evaluation revealed something important. The models were calibrated on </w:t>
+      </w:r>
+      <w:r>
+        <w:t>“</w:t>
+      </w:r>
+      <w:r>
+        <w:t>Patient 100's</w:t>
+      </w:r>
+      <w:r>
+        <w:t>”</w:t>
+      </w:r>
+      <w:r>
+        <w:t xml:space="preserve"> 1.5% anomaly rate. The full database has a 30.8% anomaly rate. The model was deliberately conservative </w:t>
+      </w:r>
+      <w:r>
+        <w:t>–</w:t>
+      </w:r>
+      <w:r>
+        <w:t xml:space="preserve"> and on a dataset where some patients are 100% abnormal, that conservatism shows as low recall. This is not a failure of the models. It is an honest finding about what patient-specific calibration means. A threshold that protects against false alarms on one patient may miss real anomalies on another. VitalWatch V2 reveals this boundary clearly </w:t>
+      </w:r>
+      <w:r>
+        <w:t>–</w:t>
+      </w:r>
+      <w:r>
+        <w:t xml:space="preserve"> and in doing so, defines exactly what V3 needs to solve.</w:t>
+      </w:r>
+    </w:p>
+    <w:p>
+      <w:pPr>
+        <w:tabs>
+          <w:tab w:val="left" w:pos="2610"/>
+        </w:tabs>
+      </w:pPr>
+    </w:p>
+    <w:p>
+      <w:pPr>
+        <w:tabs>
+          <w:tab w:val="left" w:pos="2610"/>
+        </w:tabs>
+      </w:pPr>
+    </w:p>
+    <w:p>
+      <w:pPr>
+        <w:tabs>
+          <w:tab w:val="left" w:pos="2610"/>
+        </w:tabs>
+      </w:pPr>
+    </w:p>
+    <w:p>
+      <w:pPr>
+        <w:tabs>
+          <w:tab w:val="left" w:pos="2610"/>
+        </w:tabs>
+      </w:pPr>
+      <w:r>
+        <w:lastRenderedPageBreak/>
+        <w:t>A solid outcome from the notebook and an input to the paper:</w:t>
+      </w:r>
+    </w:p>
+    <w:p>
+      <w:pPr>
+        <w:tabs>
+          <w:tab w:val="left" w:pos="2610"/>
+        </w:tabs>
+      </w:pPr>
+      <w:r>
+        <w:t xml:space="preserve">"Across 108,098 beats from 46 MIT-BIH records, the Autoencoder achieved the highest overall F1 score of 0.311 with precision 0.646 and recall 0.205. The AND ensemble achieved the highest precision at 0.750, indicating that when all models agreed on an anomaly, they were correct in three out of four cases. Recall was consistently low across all configurations, attributable to the calibration mismatch between the 1.5% contamination prior derived from the single-patient baseline and the 30.8% overall anomaly rate of the full database. Per-record analysis revealed that performance directly correlates with the distance between each record's class distribution and the training distribution </w:t>
+      </w:r>
+      <w:r>
+        <w:t>–</w:t>
+      </w:r>
+      <w:r>
+        <w:t xml:space="preserve"> a finding that motivates patient-specific adaptive thresholding as future work."</w:t>
+      </w:r>
+    </w:p>
+    <w:p>
+      <w:pPr>
+        <w:tabs>
+          <w:tab w:val="left" w:pos="2610"/>
+        </w:tabs>
+        <w:rPr>
+          <w:rStyle w:val="IntenseEmphasis"/>
+        </w:rPr>
+      </w:pPr>
+      <w:r>
+        <w:rPr>
+          <w:rStyle w:val="IntenseEmphasis"/>
+        </w:rPr>
+        <w:t>Ever wondered why did we not changed the contamination parameter from c=0.015 to any other values?</w:t>
+      </w:r>
+    </w:p>
+    <w:p>
+      <w:pPr>
+        <w:pStyle w:val="ListParagraph"/>
+      </w:pPr>
+      <w:r>
+        <w:t>Understand that contamination is not just a number or some hyperparameter, it is a prior belief about the world. What c=0.015 means is that we are telling the model “</w:t>
+      </w:r>
+      <w:r>
+        <w:rPr>
+          <w:i/>
+          <w:iCs/>
+        </w:rPr>
+        <w:t>Hey! You know what? I expect approximately about 1.5% of beats to be anomalous</w:t>
+      </w:r>
+      <w:r>
+        <w:t>”. This assumption was drawn from ‘Patient 100’.</w:t>
+      </w:r>
+    </w:p>
+    <w:p>
+      <w:pPr>
+        <w:tabs>
+          <w:tab w:val="left" w:pos="2610"/>
+        </w:tabs>
+        <w:rPr>
+          <w:rStyle w:val="IntenseEmphasis"/>
+        </w:rPr>
+      </w:pPr>
+      <w:r>
+        <w:rPr>
+          <w:rStyle w:val="IntenseEmphasis"/>
+        </w:rPr>
+        <w:t>So how does not changing this parameter was the right call?</w:t>
+      </w:r>
+    </w:p>
+    <w:p>
+      <w:pPr>
+        <w:pStyle w:val="ListParagraph"/>
+      </w:pPr>
+      <w:r>
+        <w:t xml:space="preserve">I </w:t>
+      </w:r>
+      <w:r>
+        <w:t>deliberately kept it at 0.015 even after discovering the full database has 30.8% abnormal beats.</w:t>
+      </w:r>
+    </w:p>
+    <w:p>
+      <w:pPr>
+        <w:pStyle w:val="ListParagraph"/>
+      </w:pPr>
+      <w:r>
+        <w:t xml:space="preserve">In a real IoT deployment </w:t>
+      </w:r>
+      <w:r>
+        <w:t>–</w:t>
+      </w:r>
+      <w:r>
+        <w:t xml:space="preserve"> which is </w:t>
+      </w:r>
+      <w:proofErr w:type="spellStart"/>
+      <w:r>
+        <w:t>VitalWatch's</w:t>
+      </w:r>
+      <w:proofErr w:type="spellEnd"/>
+      <w:r>
+        <w:t xml:space="preserve"> clinical scenario </w:t>
+      </w:r>
+      <w:r>
+        <w:t>–</w:t>
+      </w:r>
+      <w:r>
+        <w:t xml:space="preserve"> the model is pre-trained and deployed before it sees the patient. The doctor does not know upfront whether the incoming patient has 1.5% or 100% abnormal beats. The model must operate on a fixed prior.</w:t>
+      </w:r>
+    </w:p>
+    <w:p>
+      <w:pPr>
+        <w:pStyle w:val="ListParagraph"/>
+      </w:pPr>
+      <w:r>
+        <w:t xml:space="preserve">If at all I had changed it to c=0.308, which describes the full dataset, I would be leaking the data at the model level. </w:t>
+      </w:r>
+    </w:p>
+    <w:p>
+      <w:pPr>
+        <w:tabs>
+          <w:tab w:val="left" w:pos="2610"/>
+        </w:tabs>
+        <w:rPr>
+          <w:rStyle w:val="IntenseEmphasis"/>
+        </w:rPr>
+      </w:pPr>
+      <w:r>
+        <w:rPr>
+          <w:rStyle w:val="IntenseEmphasis"/>
+        </w:rPr>
+        <w:t xml:space="preserve">How does that get interpreted? </w:t>
+      </w:r>
+    </w:p>
+    <w:p>
+      <w:pPr>
+        <w:pStyle w:val="ListParagraph"/>
+      </w:pPr>
+      <w:r>
+        <w:t>Using the knowledge of test distribution to tune the training configuration would give the scope of training data which we deliberately kept it hidden from the model during the training (recall the 100% abnormal data from 8 patient?). Introducing these for training would only saturate the learning and the metrics would change in terms of evaluation.</w:t>
+      </w:r>
+    </w:p>
+    <w:p>
+      <w:pPr>
+        <w:tabs>
+          <w:tab w:val="left" w:pos="2610"/>
+        </w:tabs>
+      </w:pPr>
+      <w:r>
+        <w:t>Key Findings:</w:t>
+      </w:r>
+    </w:p>
+    <w:p>
+      <w:pPr>
+        <w:tabs>
+          <w:tab w:val="left" w:pos="2610"/>
+        </w:tabs>
+      </w:pPr>
+      <w:r>
+        <w:t>1. Autoencoder achieves highest F1 (0.311)</w:t>
+      </w:r>
+    </w:p>
+    <w:p>
+      <w:pPr>
+        <w:tabs>
+          <w:tab w:val="left" w:pos="2610"/>
+        </w:tabs>
+      </w:pPr>
+      <w:r>
+        <w:t>2. AND Ensemble achieves highest Precision (0.750)</w:t>
+      </w:r>
+    </w:p>
+    <w:p>
+      <w:pPr>
+        <w:tabs>
+          <w:tab w:val="left" w:pos="2610"/>
+        </w:tabs>
+      </w:pPr>
+      <w:r>
+        <w:t>3. Low recall explained by calibration mismatch</w:t>
+      </w:r>
+    </w:p>
+    <w:p>
+      <w:pPr>
+        <w:tabs>
+          <w:tab w:val="left" w:pos="2610"/>
+        </w:tabs>
+      </w:pPr>
+      <w:r>
+        <w:t xml:space="preserve">   (contamination=0.015 vs actual 30.8% rate)</w:t>
+      </w:r>
+    </w:p>
+    <w:p>
+      <w:pPr>
+        <w:tabs>
+          <w:tab w:val="left" w:pos="2610"/>
+        </w:tabs>
+      </w:pPr>
+      <w:r>
+        <w:t>4. Per-record F1 correlates with distribution</w:t>
+      </w:r>
+    </w:p>
+    <w:p>
+      <w:pPr>
+        <w:tabs>
+          <w:tab w:val="left" w:pos="2610"/>
+        </w:tabs>
+      </w:pPr>
+      <w:r>
+        <w:t xml:space="preserve">   similarity to training data</w:t>
+      </w:r>
+    </w:p>
+    <w:p>
+      <w:pPr>
+        <w:tabs>
+          <w:tab w:val="left" w:pos="2610"/>
+        </w:tabs>
+      </w:pPr>
+      <w:r>
+        <w:t>5. Patient-specific thresholding identified</w:t>
+      </w:r>
+    </w:p>
+    <w:p>
+      <w:pPr>
+        <w:tabs>
+          <w:tab w:val="left" w:pos="2610"/>
+        </w:tabs>
+      </w:pPr>
+      <w:r>
+        <w:t xml:space="preserve">   as primary future work</w:t>
+      </w:r>
+    </w:p>
+    <w:p>
+      <w:pPr>
+        <w:tabs>
+          <w:tab w:val="left" w:pos="2610"/>
+        </w:tabs>
+      </w:pPr>
+      <w:r>
+        <w:lastRenderedPageBreak/>
+        <w:t>Next thing would be to compare this output generated from our models with one of the standard baseline references to see how our models stood out.</w:t>
+      </w:r>
+    </w:p>
+    <w:p>
+      <w:pPr>
+        <w:tabs>
+          <w:tab w:val="left" w:pos="2610"/>
+        </w:tabs>
+        <w:rPr>
+          <w:rStyle w:val="IntenseEmphasis"/>
+        </w:rPr>
+      </w:pPr>
+      <w:r>
+        <w:rPr>
+          <w:rStyle w:val="IntenseEmphasis"/>
+        </w:rPr>
+        <w:t>Why Pan-Tompkins?</w:t>
+      </w:r>
+    </w:p>
+    <w:p>
+      <w:pPr>
+        <w:pStyle w:val="ListParagraph"/>
+      </w:pPr>
+      <w:r>
+        <w:t xml:space="preserve">After googling around and diving deeper into the topic of signal processing especially in the field of healthcare (ECG for now), Pan-Tompkins is a classical signal processing algorithm which was published by </w:t>
+      </w:r>
+      <w:proofErr w:type="spellStart"/>
+      <w:r>
+        <w:t>Jiapu</w:t>
+      </w:r>
+      <w:proofErr w:type="spellEnd"/>
+      <w:r>
+        <w:t xml:space="preserve"> Pan and Willis Tompkins. This model detects R-peaks in ECG using bandpass filtering and adaptive thresholding. And to my surprise, this was published back in 1985! It has been the standard ECG processing benchmark till date and is mostly cited </w:t>
+      </w:r>
+      <w:r>
+        <w:t>in about hundreds of publications.</w:t>
+      </w:r>
+    </w:p>
+    <w:p>
+      <w:pPr>
+        <w:tabs>
+          <w:tab w:val="left" w:pos="2610"/>
+        </w:tabs>
+        <w:rPr>
+          <w:rStyle w:val="IntenseEmphasis"/>
+        </w:rPr>
+      </w:pPr>
+      <w:r>
+        <w:rPr>
+          <w:rStyle w:val="IntenseEmphasis"/>
+        </w:rPr>
+        <w:t>Do we have to extract and build it from scratch?</w:t>
+      </w:r>
+    </w:p>
+    <w:p>
+      <w:pPr>
+        <w:pStyle w:val="ListParagraph"/>
+      </w:pPr>
+      <w:r>
+        <w:t>No! I will not be building it from scratch, rather, I will use the library “nuerokit2” which is going to implement it for me (and to all of us, of course!). The concept remains the same, detect the beats -&gt; classify anything outside normal RR as anomalous -&gt; measure its performance against our model on same data.</w:t>
+      </w:r>
+    </w:p>
+    <w:p>
+      <w:r>
+        <w:t>After running the baseline model, the</w:t>
+      </w:r>
+      <w:r>
+        <w:t xml:space="preserve"> results delivered something I did not expect</w:t>
+      </w:r>
+    </w:p>
+    <w:p>
+      <w:pPr>
+        <w:spacing w:after="0"/>
+      </w:pPr>
+      <w:r>
+        <w:t xml:space="preserve">Pan-Tompkins: F1 = </w:t>
+      </w:r>
+      <w:r>
+        <w:rPr>
+          <w:b/>
+          <w:bCs/>
+        </w:rPr>
+        <w:t>0.5245</w:t>
+      </w:r>
+    </w:p>
+    <w:p>
+      <w:pPr>
+        <w:spacing w:after="0"/>
+      </w:pPr>
+      <w:r>
+        <w:t xml:space="preserve">VitalWatch Autoencoder: F1 = </w:t>
+      </w:r>
+      <w:r>
+        <w:rPr>
+          <w:b/>
+          <w:bCs/>
+        </w:rPr>
+        <w:t>0.5492</w:t>
+      </w:r>
+    </w:p>
+    <w:p>
+      <w:pPr>
+        <w:spacing w:after="0"/>
+      </w:pPr>
+      <w:r>
+        <w:t xml:space="preserve">VitalWatch OR Ensemble: F1 = </w:t>
+      </w:r>
+      <w:r>
+        <w:rPr>
+          <w:b/>
+          <w:bCs/>
+        </w:rPr>
+        <w:t>0.5556</w:t>
+      </w:r>
+    </w:p>
+    <w:p>
+      <w:r>
+        <w:t>Both the Autoencoder and the OR Ensemble outperformed Pan-Tompkins on the same 10 records.</w:t>
+      </w:r>
+    </w:p>
+    <w:p>
+      <w:r>
+        <w:t xml:space="preserve">This is the paper's core claim </w:t>
+      </w:r>
+      <w:r>
+        <w:t>–</w:t>
+      </w:r>
+      <w:r>
+        <w:t xml:space="preserve"> an unsupervised ML model trained with zero labelled data matches and exceeds a rule-based clinical algorithm that has been the field standard for 40 years.</w:t>
+      </w:r>
+    </w:p>
+    <w:p>
+      <w:r>
+        <w:t xml:space="preserve">But the per-record breakdown tells an even more interesting story. Pan-Tompkins works well when anomalies are extreme </w:t>
+      </w:r>
+      <w:r>
+        <w:t>–</w:t>
+      </w:r>
+      <w:r>
+        <w:t xml:space="preserve"> records 106, 119, 200, 208 show F1 scores of </w:t>
+      </w:r>
+      <w:r>
+        <w:rPr>
+          <w:b/>
+          <w:bCs/>
+        </w:rPr>
+        <w:t>0.68–0.74</w:t>
+      </w:r>
+      <w:r>
+        <w:t xml:space="preserve">. These are records with severe rhythm deviations that any RR threshold would catch. But on subtle anomalies </w:t>
+      </w:r>
+      <w:r>
+        <w:t>–</w:t>
+      </w:r>
+      <w:r>
+        <w:t xml:space="preserve"> records 100, 101, 112 </w:t>
+      </w:r>
+      <w:r>
+        <w:t>–</w:t>
+      </w:r>
+      <w:r>
+        <w:t xml:space="preserve"> Pan-Tompkins returns F1=0.000. It misses them entirely because the RR intervals are within the normal range. VitalWatch catches them because it learned the pattern, not just the threshold.</w:t>
+      </w:r>
+    </w:p>
+    <w:p>
+      <w:r>
+        <w:rPr>
+          <w:i/>
+          <w:iCs/>
+        </w:rPr>
+        <w:t xml:space="preserve">Record 113 is the most alarming. Pan-Tompkins flagged 1,626 beats out of 1,795 total as anomalous. Only 5 were real. Precision of 0.002. That is not a monitoring system </w:t>
+      </w:r>
+      <w:r>
+        <w:rPr>
+          <w:i/>
+          <w:iCs/>
+        </w:rPr>
+        <w:t>–</w:t>
+      </w:r>
+      <w:r>
+        <w:rPr>
+          <w:i/>
+          <w:iCs/>
+        </w:rPr>
+        <w:t xml:space="preserve"> that is noise. VitalWatch on the same record is significantly more precise</w:t>
+      </w:r>
+      <w:r>
+        <w:t>.</w:t>
+      </w:r>
+    </w:p>
+    <w:p>
+      <w:r>
+        <w:t xml:space="preserve">The conclusion is clear. </w:t>
+      </w:r>
+      <w:r>
+        <w:rPr>
+          <w:b/>
+          <w:bCs/>
+        </w:rPr>
+        <w:t>Fixed threshold methods like Pan-Tompkins are strong on extreme cases</w:t>
+      </w:r>
+      <w:r>
+        <w:t xml:space="preserve"> but blind to subtlety and </w:t>
+      </w:r>
+      <w:r>
+        <w:rPr>
+          <w:b/>
+          <w:bCs/>
+        </w:rPr>
+        <w:t>prone to catastrophic false alarms</w:t>
+      </w:r>
+      <w:r>
+        <w:t xml:space="preserve"> on certain patient profiles. Learned unsupervised models are more balanced across the full spectrum of cardiac presentations.</w:t>
+      </w:r>
+    </w:p>
+    <w:p>
+      <w:pPr>
+        <w:tabs>
+          <w:tab w:val="left" w:pos="2610"/>
+        </w:tabs>
+      </w:pPr>
     </w:p>
     <w:sectPr>
       <w:pgSz w:w="11906" w:h="16838"/>
-      <w:pgMar w:top="568" w:right="1440" w:bottom="1440" w:left="1440" w:header="708" w:footer="708" w:gutter="0"/>
+      <w:pgMar w:top="568" w:right="1440" w:bottom="1560" w:left="1276" w:header="708" w:footer="708" w:gutter="0"/>
       <w:cols w:space="708"/>
       <w:docGrid w:linePitch="360"/>
     </w:sectPr>
@@ -6681,6 +9173,119 @@
     </w:lvl>
   </w:abstractNum>
   <w:abstractNum w:abstractNumId="1" w15:restartNumberingAfterBreak="0">
+    <w:nsid w:val="1C0B7F4B"/>
+    <w:multiLevelType w:val="hybridMultilevel"/>
+    <w:tmpl w:val="75246A32"/>
+    <w:lvl w:ilvl="0" w:tplc="4009000B">
+      <w:start w:val="1"/>
+      <w:numFmt w:val="bullet"/>
+      <w:lvlText w:val=""/>
+      <w:lvlJc w:val="left"/>
+      <w:pPr>
+        <w:ind w:left="1440" w:hanging="360"/>
+      </w:pPr>
+      <w:rPr>
+        <w:rFonts w:ascii="Wingdings" w:hAnsi="Wingdings" w:hint="default"/>
+      </w:rPr>
+    </w:lvl>
+    <w:lvl w:ilvl="1" w:tplc="40090003" w:tentative="1">
+      <w:start w:val="1"/>
+      <w:numFmt w:val="bullet"/>
+      <w:lvlText w:val="o"/>
+      <w:lvlJc w:val="left"/>
+      <w:pPr>
+        <w:ind w:left="2160" w:hanging="360"/>
+      </w:pPr>
+      <w:rPr>
+        <w:rFonts w:ascii="Courier New" w:hAnsi="Courier New" w:cs="Courier New" w:hint="default"/>
+      </w:rPr>
+    </w:lvl>
+    <w:lvl w:ilvl="2" w:tplc="40090005" w:tentative="1">
+      <w:start w:val="1"/>
+      <w:numFmt w:val="bullet"/>
+      <w:lvlText w:val=""/>
+      <w:lvlJc w:val="left"/>
+      <w:pPr>
+        <w:ind w:left="2880" w:hanging="360"/>
+      </w:pPr>
+      <w:rPr>
+        <w:rFonts w:ascii="Wingdings" w:hAnsi="Wingdings" w:hint="default"/>
+      </w:rPr>
+    </w:lvl>
+    <w:lvl w:ilvl="3" w:tplc="40090001" w:tentative="1">
+      <w:start w:val="1"/>
+      <w:numFmt w:val="bullet"/>
+      <w:lvlText w:val=""/>
+      <w:lvlJc w:val="left"/>
+      <w:pPr>
+        <w:ind w:left="3600" w:hanging="360"/>
+      </w:pPr>
+      <w:rPr>
+        <w:rFonts w:ascii="Symbol" w:hAnsi="Symbol" w:hint="default"/>
+      </w:rPr>
+    </w:lvl>
+    <w:lvl w:ilvl="4" w:tplc="40090003" w:tentative="1">
+      <w:start w:val="1"/>
+      <w:numFmt w:val="bullet"/>
+      <w:lvlText w:val="o"/>
+      <w:lvlJc w:val="left"/>
+      <w:pPr>
+        <w:ind w:left="4320" w:hanging="360"/>
+      </w:pPr>
+      <w:rPr>
+        <w:rFonts w:ascii="Courier New" w:hAnsi="Courier New" w:cs="Courier New" w:hint="default"/>
+      </w:rPr>
+    </w:lvl>
+    <w:lvl w:ilvl="5" w:tplc="40090005" w:tentative="1">
+      <w:start w:val="1"/>
+      <w:numFmt w:val="bullet"/>
+      <w:lvlText w:val=""/>
+      <w:lvlJc w:val="left"/>
+      <w:pPr>
+        <w:ind w:left="5040" w:hanging="360"/>
+      </w:pPr>
+      <w:rPr>
+        <w:rFonts w:ascii="Wingdings" w:hAnsi="Wingdings" w:hint="default"/>
+      </w:rPr>
+    </w:lvl>
+    <w:lvl w:ilvl="6" w:tplc="40090001" w:tentative="1">
+      <w:start w:val="1"/>
+      <w:numFmt w:val="bullet"/>
+      <w:lvlText w:val=""/>
+      <w:lvlJc w:val="left"/>
+      <w:pPr>
+        <w:ind w:left="5760" w:hanging="360"/>
+      </w:pPr>
+      <w:rPr>
+        <w:rFonts w:ascii="Symbol" w:hAnsi="Symbol" w:hint="default"/>
+      </w:rPr>
+    </w:lvl>
+    <w:lvl w:ilvl="7" w:tplc="40090003" w:tentative="1">
+      <w:start w:val="1"/>
+      <w:numFmt w:val="bullet"/>
+      <w:lvlText w:val="o"/>
+      <w:lvlJc w:val="left"/>
+      <w:pPr>
+        <w:ind w:left="6480" w:hanging="360"/>
+      </w:pPr>
+      <w:rPr>
+        <w:rFonts w:ascii="Courier New" w:hAnsi="Courier New" w:cs="Courier New" w:hint="default"/>
+      </w:rPr>
+    </w:lvl>
+    <w:lvl w:ilvl="8" w:tplc="40090005" w:tentative="1">
+      <w:start w:val="1"/>
+      <w:numFmt w:val="bullet"/>
+      <w:lvlText w:val=""/>
+      <w:lvlJc w:val="left"/>
+      <w:pPr>
+        <w:ind w:left="7200" w:hanging="360"/>
+      </w:pPr>
+      <w:rPr>
+        <w:rFonts w:ascii="Wingdings" w:hAnsi="Wingdings" w:hint="default"/>
+      </w:rPr>
+    </w:lvl>
+  </w:abstractNum>
+  <w:abstractNum w:abstractNumId="2" w15:restartNumberingAfterBreak="0">
     <w:nsid w:val="267F05E8"/>
     <w:multiLevelType w:val="hybridMultilevel"/>
     <w:tmpl w:val="B312643C"/>
@@ -6792,7 +9397,7 @@
       </w:rPr>
     </w:lvl>
   </w:abstractNum>
-  <w:abstractNum w:abstractNumId="2" w15:restartNumberingAfterBreak="0">
+  <w:abstractNum w:abstractNumId="3" w15:restartNumberingAfterBreak="0">
     <w:nsid w:val="2A221F41"/>
     <w:multiLevelType w:val="multilevel"/>
     <w:tmpl w:val="7B668944"/>
@@ -6941,7 +9546,156 @@
       </w:rPr>
     </w:lvl>
   </w:abstractNum>
-  <w:abstractNum w:abstractNumId="3" w15:restartNumberingAfterBreak="0">
+  <w:abstractNum w:abstractNumId="4" w15:restartNumberingAfterBreak="0">
+    <w:nsid w:val="3A2D128F"/>
+    <w:multiLevelType w:val="multilevel"/>
+    <w:tmpl w:val="43600AC0"/>
+    <w:lvl w:ilvl="0">
+      <w:start w:val="1"/>
+      <w:numFmt w:val="bullet"/>
+      <w:lvlText w:val=""/>
+      <w:lvlJc w:val="left"/>
+      <w:pPr>
+        <w:tabs>
+          <w:tab w:val="num" w:pos="720"/>
+        </w:tabs>
+        <w:ind w:left="720" w:hanging="360"/>
+      </w:pPr>
+      <w:rPr>
+        <w:rFonts w:ascii="Symbol" w:hAnsi="Symbol" w:hint="default"/>
+        <w:sz w:val="20"/>
+      </w:rPr>
+    </w:lvl>
+    <w:lvl w:ilvl="1" w:tentative="1">
+      <w:start w:val="1"/>
+      <w:numFmt w:val="bullet"/>
+      <w:lvlText w:val=""/>
+      <w:lvlJc w:val="left"/>
+      <w:pPr>
+        <w:tabs>
+          <w:tab w:val="num" w:pos="1440"/>
+        </w:tabs>
+        <w:ind w:left="1440" w:hanging="360"/>
+      </w:pPr>
+      <w:rPr>
+        <w:rFonts w:ascii="Symbol" w:hAnsi="Symbol" w:hint="default"/>
+        <w:sz w:val="20"/>
+      </w:rPr>
+    </w:lvl>
+    <w:lvl w:ilvl="2" w:tentative="1">
+      <w:start w:val="1"/>
+      <w:numFmt w:val="bullet"/>
+      <w:lvlText w:val=""/>
+      <w:lvlJc w:val="left"/>
+      <w:pPr>
+        <w:tabs>
+          <w:tab w:val="num" w:pos="2160"/>
+        </w:tabs>
+        <w:ind w:left="2160" w:hanging="360"/>
+      </w:pPr>
+      <w:rPr>
+        <w:rFonts w:ascii="Symbol" w:hAnsi="Symbol" w:hint="default"/>
+        <w:sz w:val="20"/>
+      </w:rPr>
+    </w:lvl>
+    <w:lvl w:ilvl="3" w:tentative="1">
+      <w:start w:val="1"/>
+      <w:numFmt w:val="bullet"/>
+      <w:lvlText w:val=""/>
+      <w:lvlJc w:val="left"/>
+      <w:pPr>
+        <w:tabs>
+          <w:tab w:val="num" w:pos="2880"/>
+        </w:tabs>
+        <w:ind w:left="2880" w:hanging="360"/>
+      </w:pPr>
+      <w:rPr>
+        <w:rFonts w:ascii="Symbol" w:hAnsi="Symbol" w:hint="default"/>
+        <w:sz w:val="20"/>
+      </w:rPr>
+    </w:lvl>
+    <w:lvl w:ilvl="4" w:tentative="1">
+      <w:start w:val="1"/>
+      <w:numFmt w:val="bullet"/>
+      <w:lvlText w:val=""/>
+      <w:lvlJc w:val="left"/>
+      <w:pPr>
+        <w:tabs>
+          <w:tab w:val="num" w:pos="3600"/>
+        </w:tabs>
+        <w:ind w:left="3600" w:hanging="360"/>
+      </w:pPr>
+      <w:rPr>
+        <w:rFonts w:ascii="Symbol" w:hAnsi="Symbol" w:hint="default"/>
+        <w:sz w:val="20"/>
+      </w:rPr>
+    </w:lvl>
+    <w:lvl w:ilvl="5" w:tentative="1">
+      <w:start w:val="1"/>
+      <w:numFmt w:val="bullet"/>
+      <w:lvlText w:val=""/>
+      <w:lvlJc w:val="left"/>
+      <w:pPr>
+        <w:tabs>
+          <w:tab w:val="num" w:pos="4320"/>
+        </w:tabs>
+        <w:ind w:left="4320" w:hanging="360"/>
+      </w:pPr>
+      <w:rPr>
+        <w:rFonts w:ascii="Symbol" w:hAnsi="Symbol" w:hint="default"/>
+        <w:sz w:val="20"/>
+      </w:rPr>
+    </w:lvl>
+    <w:lvl w:ilvl="6" w:tentative="1">
+      <w:start w:val="1"/>
+      <w:numFmt w:val="bullet"/>
+      <w:lvlText w:val=""/>
+      <w:lvlJc w:val="left"/>
+      <w:pPr>
+        <w:tabs>
+          <w:tab w:val="num" w:pos="5040"/>
+        </w:tabs>
+        <w:ind w:left="5040" w:hanging="360"/>
+      </w:pPr>
+      <w:rPr>
+        <w:rFonts w:ascii="Symbol" w:hAnsi="Symbol" w:hint="default"/>
+        <w:sz w:val="20"/>
+      </w:rPr>
+    </w:lvl>
+    <w:lvl w:ilvl="7" w:tentative="1">
+      <w:start w:val="1"/>
+      <w:numFmt w:val="bullet"/>
+      <w:lvlText w:val=""/>
+      <w:lvlJc w:val="left"/>
+      <w:pPr>
+        <w:tabs>
+          <w:tab w:val="num" w:pos="5760"/>
+        </w:tabs>
+        <w:ind w:left="5760" w:hanging="360"/>
+      </w:pPr>
+      <w:rPr>
+        <w:rFonts w:ascii="Symbol" w:hAnsi="Symbol" w:hint="default"/>
+        <w:sz w:val="20"/>
+      </w:rPr>
+    </w:lvl>
+    <w:lvl w:ilvl="8" w:tentative="1">
+      <w:start w:val="1"/>
+      <w:numFmt w:val="bullet"/>
+      <w:lvlText w:val=""/>
+      <w:lvlJc w:val="left"/>
+      <w:pPr>
+        <w:tabs>
+          <w:tab w:val="num" w:pos="6480"/>
+        </w:tabs>
+        <w:ind w:left="6480" w:hanging="360"/>
+      </w:pPr>
+      <w:rPr>
+        <w:rFonts w:ascii="Symbol" w:hAnsi="Symbol" w:hint="default"/>
+        <w:sz w:val="20"/>
+      </w:rPr>
+    </w:lvl>
+  </w:abstractNum>
+  <w:abstractNum w:abstractNumId="5" w15:restartNumberingAfterBreak="0">
     <w:nsid w:val="59A43B6B"/>
     <w:multiLevelType w:val="hybridMultilevel"/>
     <w:tmpl w:val="F96E7F90"/>
@@ -7030,7 +9784,7 @@
       </w:pPr>
     </w:lvl>
   </w:abstractNum>
-  <w:abstractNum w:abstractNumId="4" w15:restartNumberingAfterBreak="0">
+  <w:abstractNum w:abstractNumId="6" w15:restartNumberingAfterBreak="0">
     <w:nsid w:val="65886043"/>
     <w:multiLevelType w:val="hybridMultilevel"/>
     <w:tmpl w:val="80140594"/>
@@ -7119,7 +9873,7 @@
       </w:pPr>
     </w:lvl>
   </w:abstractNum>
-  <w:abstractNum w:abstractNumId="5" w15:restartNumberingAfterBreak="0">
+  <w:abstractNum w:abstractNumId="7" w15:restartNumberingAfterBreak="0">
     <w:nsid w:val="67283ABB"/>
     <w:multiLevelType w:val="hybridMultilevel"/>
     <w:tmpl w:val="24DA4AAA"/>
@@ -7232,7 +9986,7 @@
       </w:rPr>
     </w:lvl>
   </w:abstractNum>
-  <w:abstractNum w:abstractNumId="6" w15:restartNumberingAfterBreak="0">
+  <w:abstractNum w:abstractNumId="8" w15:restartNumberingAfterBreak="0">
     <w:nsid w:val="6FBA0FB9"/>
     <w:multiLevelType w:val="hybridMultilevel"/>
     <w:tmpl w:val="B81CA0E2"/>
@@ -7344,26 +10098,148 @@
       </w:rPr>
     </w:lvl>
   </w:abstractNum>
+  <w:abstractNum w:abstractNumId="9" w15:restartNumberingAfterBreak="0">
+    <w:nsid w:val="76C41887"/>
+    <w:multiLevelType w:val="hybridMultilevel"/>
+    <w:tmpl w:val="60C248AC"/>
+    <w:lvl w:ilvl="0" w:tplc="40090001">
+      <w:start w:val="1"/>
+      <w:numFmt w:val="bullet"/>
+      <w:lvlText w:val=""/>
+      <w:lvlJc w:val="left"/>
+      <w:pPr>
+        <w:ind w:left="720" w:hanging="360"/>
+      </w:pPr>
+      <w:rPr>
+        <w:rFonts w:ascii="Symbol" w:hAnsi="Symbol" w:hint="default"/>
+      </w:rPr>
+    </w:lvl>
+    <w:lvl w:ilvl="1" w:tplc="40090003" w:tentative="1">
+      <w:start w:val="1"/>
+      <w:numFmt w:val="bullet"/>
+      <w:lvlText w:val="o"/>
+      <w:lvlJc w:val="left"/>
+      <w:pPr>
+        <w:ind w:left="1440" w:hanging="360"/>
+      </w:pPr>
+      <w:rPr>
+        <w:rFonts w:ascii="Courier New" w:hAnsi="Courier New" w:cs="Courier New" w:hint="default"/>
+      </w:rPr>
+    </w:lvl>
+    <w:lvl w:ilvl="2" w:tplc="40090005" w:tentative="1">
+      <w:start w:val="1"/>
+      <w:numFmt w:val="bullet"/>
+      <w:lvlText w:val=""/>
+      <w:lvlJc w:val="left"/>
+      <w:pPr>
+        <w:ind w:left="2160" w:hanging="360"/>
+      </w:pPr>
+      <w:rPr>
+        <w:rFonts w:ascii="Wingdings" w:hAnsi="Wingdings" w:hint="default"/>
+      </w:rPr>
+    </w:lvl>
+    <w:lvl w:ilvl="3" w:tplc="40090001" w:tentative="1">
+      <w:start w:val="1"/>
+      <w:numFmt w:val="bullet"/>
+      <w:lvlText w:val=""/>
+      <w:lvlJc w:val="left"/>
+      <w:pPr>
+        <w:ind w:left="2880" w:hanging="360"/>
+      </w:pPr>
+      <w:rPr>
+        <w:rFonts w:ascii="Symbol" w:hAnsi="Symbol" w:hint="default"/>
+      </w:rPr>
+    </w:lvl>
+    <w:lvl w:ilvl="4" w:tplc="40090003" w:tentative="1">
+      <w:start w:val="1"/>
+      <w:numFmt w:val="bullet"/>
+      <w:lvlText w:val="o"/>
+      <w:lvlJc w:val="left"/>
+      <w:pPr>
+        <w:ind w:left="3600" w:hanging="360"/>
+      </w:pPr>
+      <w:rPr>
+        <w:rFonts w:ascii="Courier New" w:hAnsi="Courier New" w:cs="Courier New" w:hint="default"/>
+      </w:rPr>
+    </w:lvl>
+    <w:lvl w:ilvl="5" w:tplc="40090005" w:tentative="1">
+      <w:start w:val="1"/>
+      <w:numFmt w:val="bullet"/>
+      <w:lvlText w:val=""/>
+      <w:lvlJc w:val="left"/>
+      <w:pPr>
+        <w:ind w:left="4320" w:hanging="360"/>
+      </w:pPr>
+      <w:rPr>
+        <w:rFonts w:ascii="Wingdings" w:hAnsi="Wingdings" w:hint="default"/>
+      </w:rPr>
+    </w:lvl>
+    <w:lvl w:ilvl="6" w:tplc="40090001" w:tentative="1">
+      <w:start w:val="1"/>
+      <w:numFmt w:val="bullet"/>
+      <w:lvlText w:val=""/>
+      <w:lvlJc w:val="left"/>
+      <w:pPr>
+        <w:ind w:left="5040" w:hanging="360"/>
+      </w:pPr>
+      <w:rPr>
+        <w:rFonts w:ascii="Symbol" w:hAnsi="Symbol" w:hint="default"/>
+      </w:rPr>
+    </w:lvl>
+    <w:lvl w:ilvl="7" w:tplc="40090003" w:tentative="1">
+      <w:start w:val="1"/>
+      <w:numFmt w:val="bullet"/>
+      <w:lvlText w:val="o"/>
+      <w:lvlJc w:val="left"/>
+      <w:pPr>
+        <w:ind w:left="5760" w:hanging="360"/>
+      </w:pPr>
+      <w:rPr>
+        <w:rFonts w:ascii="Courier New" w:hAnsi="Courier New" w:cs="Courier New" w:hint="default"/>
+      </w:rPr>
+    </w:lvl>
+    <w:lvl w:ilvl="8" w:tplc="40090005" w:tentative="1">
+      <w:start w:val="1"/>
+      <w:numFmt w:val="bullet"/>
+      <w:lvlText w:val=""/>
+      <w:lvlJc w:val="left"/>
+      <w:pPr>
+        <w:ind w:left="6480" w:hanging="360"/>
+      </w:pPr>
+      <w:rPr>
+        <w:rFonts w:ascii="Wingdings" w:hAnsi="Wingdings" w:hint="default"/>
+      </w:rPr>
+    </w:lvl>
+  </w:abstractNum>
   <w:num w:numId="1" w16cid:durableId="903953201">
-    <w:abstractNumId w:val="1"/>
+    <w:abstractNumId w:val="2"/>
   </w:num>
   <w:num w:numId="2" w16cid:durableId="621115415">
+    <w:abstractNumId w:val="7"/>
+  </w:num>
+  <w:num w:numId="3" w16cid:durableId="1085296826">
+    <w:abstractNumId w:val="6"/>
+  </w:num>
+  <w:num w:numId="4" w16cid:durableId="868492223">
+    <w:abstractNumId w:val="3"/>
+  </w:num>
+  <w:num w:numId="5" w16cid:durableId="1680234244">
     <w:abstractNumId w:val="5"/>
   </w:num>
-  <w:num w:numId="3" w16cid:durableId="1085296826">
-    <w:abstractNumId w:val="4"/>
-  </w:num>
-  <w:num w:numId="4" w16cid:durableId="868492223">
-    <w:abstractNumId w:val="2"/>
-  </w:num>
-  <w:num w:numId="5" w16cid:durableId="1680234244">
-    <w:abstractNumId w:val="3"/>
-  </w:num>
   <w:num w:numId="6" w16cid:durableId="410280442">
-    <w:abstractNumId w:val="6"/>
+    <w:abstractNumId w:val="8"/>
   </w:num>
   <w:num w:numId="7" w16cid:durableId="1371687894">
     <w:abstractNumId w:val="0"/>
+  </w:num>
+  <w:num w:numId="8" w16cid:durableId="1577129314">
+    <w:abstractNumId w:val="4"/>
+  </w:num>
+  <w:num w:numId="9" w16cid:durableId="1283416590">
+    <w:abstractNumId w:val="9"/>
+  </w:num>
+  <w:num w:numId="10" w16cid:durableId="978538625">
+    <w:abstractNumId w:val="1"/>
   </w:num>
 </w:numbering>
 </file>
@@ -8457,6 +11333,88 @@
       <w:spacing w:val="5"/>
     </w:rPr>
   </w:style>
+  <w:style w:type="table" w:styleId="TableGridLight">
+    <w:name w:val="Grid Table Light"/>
+    <w:basedOn w:val="TableNormal"/>
+    <w:uiPriority w:val="40"/>
+    <w:rsid w:val="00CE3572"/>
+    <w:pPr>
+      <w:spacing w:after="0" w:line="240" w:lineRule="auto"/>
+    </w:pPr>
+    <w:tblPr>
+      <w:tblBorders>
+        <w:top w:val="single" w:sz="4" w:space="0" w:color="BFBFBF" w:themeColor="background1" w:themeShade="BF"/>
+        <w:left w:val="single" w:sz="4" w:space="0" w:color="BFBFBF" w:themeColor="background1" w:themeShade="BF"/>
+        <w:bottom w:val="single" w:sz="4" w:space="0" w:color="BFBFBF" w:themeColor="background1" w:themeShade="BF"/>
+        <w:right w:val="single" w:sz="4" w:space="0" w:color="BFBFBF" w:themeColor="background1" w:themeShade="BF"/>
+        <w:insideH w:val="single" w:sz="4" w:space="0" w:color="BFBFBF" w:themeColor="background1" w:themeShade="BF"/>
+        <w:insideV w:val="single" w:sz="4" w:space="0" w:color="BFBFBF" w:themeColor="background1" w:themeShade="BF"/>
+      </w:tblBorders>
+    </w:tblPr>
+  </w:style>
+  <w:style w:type="table" w:styleId="PlainTable1">
+    <w:name w:val="Plain Table 1"/>
+    <w:basedOn w:val="TableNormal"/>
+    <w:uiPriority w:val="41"/>
+    <w:rsid w:val="00CE3572"/>
+    <w:pPr>
+      <w:spacing w:after="0" w:line="240" w:lineRule="auto"/>
+    </w:pPr>
+    <w:tblPr>
+      <w:tblStyleRowBandSize w:val="1"/>
+      <w:tblStyleColBandSize w:val="1"/>
+      <w:tblBorders>
+        <w:top w:val="single" w:sz="4" w:space="0" w:color="BFBFBF" w:themeColor="background1" w:themeShade="BF"/>
+        <w:left w:val="single" w:sz="4" w:space="0" w:color="BFBFBF" w:themeColor="background1" w:themeShade="BF"/>
+        <w:bottom w:val="single" w:sz="4" w:space="0" w:color="BFBFBF" w:themeColor="background1" w:themeShade="BF"/>
+        <w:right w:val="single" w:sz="4" w:space="0" w:color="BFBFBF" w:themeColor="background1" w:themeShade="BF"/>
+        <w:insideH w:val="single" w:sz="4" w:space="0" w:color="BFBFBF" w:themeColor="background1" w:themeShade="BF"/>
+        <w:insideV w:val="single" w:sz="4" w:space="0" w:color="BFBFBF" w:themeColor="background1" w:themeShade="BF"/>
+      </w:tblBorders>
+    </w:tblPr>
+    <w:tblStylePr w:type="firstRow">
+      <w:rPr>
+        <w:b/>
+        <w:bCs/>
+      </w:rPr>
+    </w:tblStylePr>
+    <w:tblStylePr w:type="lastRow">
+      <w:rPr>
+        <w:b/>
+        <w:bCs/>
+      </w:rPr>
+      <w:tblPr/>
+      <w:tcPr>
+        <w:tcBorders>
+          <w:top w:val="double" w:sz="4" w:space="0" w:color="BFBFBF" w:themeColor="background1" w:themeShade="BF"/>
+        </w:tcBorders>
+      </w:tcPr>
+    </w:tblStylePr>
+    <w:tblStylePr w:type="firstCol">
+      <w:rPr>
+        <w:b/>
+        <w:bCs/>
+      </w:rPr>
+    </w:tblStylePr>
+    <w:tblStylePr w:type="lastCol">
+      <w:rPr>
+        <w:b/>
+        <w:bCs/>
+      </w:rPr>
+    </w:tblStylePr>
+    <w:tblStylePr w:type="band1Vert">
+      <w:tblPr/>
+      <w:tcPr>
+        <w:shd w:val="clear" w:color="auto" w:fill="F2F2F2" w:themeFill="background1" w:themeFillShade="F2"/>
+      </w:tcPr>
+    </w:tblStylePr>
+    <w:tblStylePr w:type="band1Horz">
+      <w:tblPr/>
+      <w:tcPr>
+        <w:shd w:val="clear" w:color="auto" w:fill="F2F2F2" w:themeFill="background1" w:themeFillShade="F2"/>
+      </w:tcPr>
+    </w:tblStylePr>
+  </w:style>
 </w:styles>
 </file>
 
@@ -8743,4 +11701,16 @@
   <a:objectDefaults/>
   <a:extraClrSchemeLst/>
 </a:theme>
+</file>
+
+<file path=customXml/item1.xml><?xml version="1.0" encoding="utf-8"?>
+<b:Sources xmlns:b="http://schemas.openxmlformats.org/officeDocument/2006/bibliography" xmlns="http://schemas.openxmlformats.org/officeDocument/2006/bibliography" SelectedStyle="\APASixthEditionOfficeOnline.xsl" StyleName="APA" Version="6"/>
+</file>
+
+<file path=customXml/itemProps1.xml><?xml version="1.0" encoding="utf-8"?>
+<ds:datastoreItem xmlns:ds="http://schemas.openxmlformats.org/officeDocument/2006/customXml" ds:itemID="{112BA39D-8619-486E-9410-77DABBB960DB}">
+  <ds:schemaRefs>
+    <ds:schemaRef ds:uri="http://schemas.openxmlformats.org/officeDocument/2006/bibliography"/>
+  </ds:schemaRefs>
+</ds:datastoreItem>
 </file>
</xml_diff>